<commit_message>
Update manual to v1.1.0 — absentee vote support
- Cover page and footer updated to Version 1.1.0
- Section 4a: added Absentee Votes field; updated majority display
  description to show round-aware two-threshold behaviour
- Section 5d: added Absentee stat box to monitoring table; clarified
  that Expected Voters adjusts per round
- Section 5f: majority threshold formula now shows Round 1 vs Round 2+
- Section 6b: added absentee checkbox step to paper ballot entry
- Section 6e (new): full absentee vote workflow table with warnings
- TOC: added 6a–6e subsection entries
- Section 11: walkthrough updated for 80 attending + 5 absentee voters;
  majority shown correctly for each round
- Section 13: majority quick reference expanded to two-threshold table;
  checklist updated for absentee field

Co-Authored-By: Claude Sonnet 4.6 <noreply@anthropic.com>
</commit_message>
<xml_diff>
--- a/manual.docx
+++ b/manual.docx
@@ -20,7 +20,7 @@
     </w:p>
     <w:p>
       <w:pPr>
-        <w:spacing w:before="120" w:after="800"/>
+        <w:spacing w:before="120" w:after="200"/>
         <w:jc w:val="center"/>
       </w:pPr>
       <w:r>
@@ -29,6 +29,19 @@
           <w:sz w:val="32"/>
         </w:rPr>
         <w:t>Complete User Manual</w:t>
+      </w:r>
+    </w:p>
+    <w:p>
+      <w:pPr>
+        <w:spacing w:before="0" w:after="600"/>
+        <w:jc w:val="center"/>
+      </w:pPr>
+      <w:r>
+        <w:rPr>
+          <w:color w:val="666666"/>
+          <w:sz w:val="22"/>
+        </w:rPr>
+        <w:t>Version 1.1.0</w:t>
       </w:r>
     </w:p>
     <w:p>
@@ -562,6 +575,111 @@
           <w:sz w:val="22"/>
         </w:rPr>
         <w:t>Paper Ballot Entry</w:t>
+      </w:r>
+    </w:p>
+    <w:p>
+      <w:pPr>
+        <w:spacing w:before="0" w:after="60"/>
+        <w:ind w:left="340"/>
+      </w:pPr>
+      <w:r>
+        <w:rPr>
+          <w:b w:val="0"/>
+          <w:color w:val="666666"/>
+          <w:sz w:val="22"/>
+        </w:rPr>
+        <w:t xml:space="preserve">   6a.  </w:t>
+      </w:r>
+      <w:r>
+        <w:rPr>
+          <w:color w:val="666666"/>
+          <w:sz w:val="22"/>
+        </w:rPr>
+        <w:t>Dynamic Behaviour</w:t>
+      </w:r>
+    </w:p>
+    <w:p>
+      <w:pPr>
+        <w:spacing w:before="0" w:after="60"/>
+        <w:ind w:left="340"/>
+      </w:pPr>
+      <w:r>
+        <w:rPr>
+          <w:b w:val="0"/>
+          <w:color w:val="666666"/>
+          <w:sz w:val="22"/>
+        </w:rPr>
+        <w:t xml:space="preserve">   6b.  </w:t>
+      </w:r>
+      <w:r>
+        <w:rPr>
+          <w:color w:val="666666"/>
+          <w:sz w:val="22"/>
+        </w:rPr>
+        <w:t>Entering a Paper Ballot</w:t>
+      </w:r>
+    </w:p>
+    <w:p>
+      <w:pPr>
+        <w:spacing w:before="0" w:after="60"/>
+        <w:ind w:left="340"/>
+      </w:pPr>
+      <w:r>
+        <w:rPr>
+          <w:b w:val="0"/>
+          <w:color w:val="666666"/>
+          <w:sz w:val="22"/>
+        </w:rPr>
+        <w:t xml:space="preserve">   6c.  </w:t>
+      </w:r>
+      <w:r>
+        <w:rPr>
+          <w:color w:val="666666"/>
+          <w:sz w:val="22"/>
+        </w:rPr>
+        <w:t>Editing a Submitted Ballot</w:t>
+      </w:r>
+    </w:p>
+    <w:p>
+      <w:pPr>
+        <w:spacing w:before="0" w:after="60"/>
+        <w:ind w:left="340"/>
+      </w:pPr>
+      <w:r>
+        <w:rPr>
+          <w:b w:val="0"/>
+          <w:color w:val="666666"/>
+          <w:sz w:val="22"/>
+        </w:rPr>
+        <w:t xml:space="preserve">   6d.  </w:t>
+      </w:r>
+      <w:r>
+        <w:rPr>
+          <w:color w:val="666666"/>
+          <w:sz w:val="22"/>
+        </w:rPr>
+        <w:t>Deleting the Last Entry</w:t>
+      </w:r>
+    </w:p>
+    <w:p>
+      <w:pPr>
+        <w:spacing w:before="0" w:after="60"/>
+        <w:ind w:left="340"/>
+      </w:pPr>
+      <w:r>
+        <w:rPr>
+          <w:b w:val="0"/>
+          <w:color w:val="666666"/>
+          <w:sz w:val="22"/>
+        </w:rPr>
+        <w:t xml:space="preserve">   6e.  </w:t>
+      </w:r>
+      <w:r>
+        <w:rPr>
+          <w:color w:val="666666"/>
+          <w:sz w:val="22"/>
+        </w:rPr>
+        <w:t>Absentee Votes</w:t>
       </w:r>
     </w:p>
     <w:p>
@@ -1171,7 +1289,20 @@
         <w:rPr>
           <w:sz w:val="22"/>
         </w:rPr>
-        <w:t>Majority threshold calculated from expected voters (floor(n/2) + 1)</w:t>
+        <w:t>Majority threshold calculated from expected voters (floor(n/2) + 1) — Round 1 includes absentee votes</w:t>
+      </w:r>
+    </w:p>
+    <w:p>
+      <w:pPr>
+        <w:pStyle w:val="ListBullet"/>
+        <w:spacing w:before="0" w:after="60"/>
+        <w:ind w:left="283"/>
+      </w:pPr>
+      <w:r>
+        <w:rPr>
+          <w:sz w:val="22"/>
+        </w:rPr>
+        <w:t>Absentee vote support — enter absentee count in setup; paper ballot volunteer marks ballots as absentee</w:t>
       </w:r>
     </w:p>
     <w:p>
@@ -2294,7 +2425,7 @@
       <w:tr>
         <w:tc>
           <w:tcPr>
-            <w:tcW w:type="dxa" w:w="2268"/>
+            <w:tcW w:type="dxa" w:w="2551"/>
             <w:shd w:val="clear" w:color="auto" w:fill="1A2744"/>
           </w:tcPr>
           <w:p>
@@ -2313,7 +2444,7 @@
         </w:tc>
         <w:tc>
           <w:tcPr>
-            <w:tcW w:type="dxa" w:w="4819"/>
+            <w:tcW w:type="dxa" w:w="4535"/>
             <w:shd w:val="clear" w:color="auto" w:fill="1A2744"/>
           </w:tcPr>
           <w:p>
@@ -2353,7 +2484,7 @@
       <w:tr>
         <w:tc>
           <w:tcPr>
-            <w:tcW w:type="dxa" w:w="2268"/>
+            <w:tcW w:type="dxa" w:w="2551"/>
             <w:shd w:val="clear" w:color="auto" w:fill="FFFFFF"/>
           </w:tcPr>
           <w:p>
@@ -2370,7 +2501,7 @@
         </w:tc>
         <w:tc>
           <w:tcPr>
-            <w:tcW w:type="dxa" w:w="4819"/>
+            <w:tcW w:type="dxa" w:w="4535"/>
             <w:shd w:val="clear" w:color="auto" w:fill="FFFFFF"/>
           </w:tcPr>
           <w:p>
@@ -2406,7 +2537,7 @@
       <w:tr>
         <w:tc>
           <w:tcPr>
-            <w:tcW w:type="dxa" w:w="2268"/>
+            <w:tcW w:type="dxa" w:w="2551"/>
             <w:shd w:val="clear" w:color="auto" w:fill="F8F6F1"/>
           </w:tcPr>
           <w:p>
@@ -2423,7 +2554,7 @@
         </w:tc>
         <w:tc>
           <w:tcPr>
-            <w:tcW w:type="dxa" w:w="4819"/>
+            <w:tcW w:type="dxa" w:w="4535"/>
             <w:shd w:val="clear" w:color="auto" w:fill="F8F6F1"/>
           </w:tcPr>
           <w:p>
@@ -2459,7 +2590,7 @@
       <w:tr>
         <w:tc>
           <w:tcPr>
-            <w:tcW w:type="dxa" w:w="2268"/>
+            <w:tcW w:type="dxa" w:w="2551"/>
             <w:shd w:val="clear" w:color="auto" w:fill="FFFFFF"/>
           </w:tcPr>
           <w:p>
@@ -2470,13 +2601,13 @@
               <w:rPr>
                 <w:sz w:val="20"/>
               </w:rPr>
-              <w:t>Expected Voters</w:t>
-            </w:r>
-          </w:p>
-        </w:tc>
-        <w:tc>
-          <w:tcPr>
-            <w:tcW w:type="dxa" w:w="4819"/>
+              <w:t>Expected Voters (attending)</w:t>
+            </w:r>
+          </w:p>
+        </w:tc>
+        <w:tc>
+          <w:tcPr>
+            <w:tcW w:type="dxa" w:w="4535"/>
             <w:shd w:val="clear" w:color="auto" w:fill="FFFFFF"/>
           </w:tcPr>
           <w:p>
@@ -2487,7 +2618,7 @@
               <w:rPr>
                 <w:sz w:val="20"/>
               </w:rPr>
-              <w:t>Total number of eligible male voters. Used for participation percentage and majority calculation.</w:t>
+              <w:t>Number of eligible male voters expected to attend the meeting in person. Used for Round 2+ majority and participation %.</w:t>
             </w:r>
           </w:p>
         </w:tc>
@@ -2504,7 +2635,60 @@
               <w:rPr>
                 <w:sz w:val="20"/>
               </w:rPr>
-              <w:t>85</w:t>
+              <w:t>80</w:t>
+            </w:r>
+          </w:p>
+        </w:tc>
+      </w:tr>
+      <w:tr>
+        <w:tc>
+          <w:tcPr>
+            <w:tcW w:type="dxa" w:w="2551"/>
+            <w:shd w:val="clear" w:color="auto" w:fill="F8F6F1"/>
+          </w:tcPr>
+          <w:p>
+            <w:pPr>
+              <w:spacing w:before="40" w:after="40"/>
+            </w:pPr>
+            <w:r>
+              <w:rPr>
+                <w:sz w:val="20"/>
+              </w:rPr>
+              <w:t>Absentee Votes (Round 1 only)</w:t>
+            </w:r>
+          </w:p>
+        </w:tc>
+        <w:tc>
+          <w:tcPr>
+            <w:tcW w:type="dxa" w:w="4535"/>
+            <w:shd w:val="clear" w:color="auto" w:fill="F8F6F1"/>
+          </w:tcPr>
+          <w:p>
+            <w:pPr>
+              <w:spacing w:before="40" w:after="40"/>
+            </w:pPr>
+            <w:r>
+              <w:rPr>
+                <w:sz w:val="20"/>
+              </w:rPr>
+              <w:t>Number of paper ballots received from eligible members who cannot attend the meeting. These are counted only in Round 1.</w:t>
+            </w:r>
+          </w:p>
+        </w:tc>
+        <w:tc>
+          <w:tcPr>
+            <w:tcW w:type="dxa" w:w="1984"/>
+            <w:shd w:val="clear" w:color="auto" w:fill="F8F6F1"/>
+          </w:tcPr>
+          <w:p>
+            <w:pPr>
+              <w:spacing w:before="40" w:after="40"/>
+            </w:pPr>
+            <w:r>
+              <w:rPr>
+                <w:sz w:val="20"/>
+              </w:rPr>
+              <w:t>5</w:t>
             </w:r>
           </w:p>
         </w:tc>
@@ -2523,7 +2707,44 @@
         <w:rPr>
           <w:sz w:val="22"/>
         </w:rPr>
-        <w:t>Below the Expected Voters field, the system automatically displays the Majority Required number: floor(Expected Voters / 2) + 1. This is the minimum number of votes a candidate must receive to be automatically suggested as elected in the Round Transition screen.</w:t>
+        <w:t>Below these fields, the system automatically displays the Majority Required threshold(s). Majority is defined as floor(n / 2) + 1, where n is the total eligible voter count for that round:</w:t>
+      </w:r>
+    </w:p>
+    <w:p>
+      <w:pPr>
+        <w:pStyle w:val="ListBullet"/>
+        <w:spacing w:before="0" w:after="60"/>
+        <w:ind w:left="283"/>
+      </w:pPr>
+      <w:r>
+        <w:rPr>
+          <w:sz w:val="22"/>
+        </w:rPr>
+        <w:t>Round 1 majority uses Expected Voters + Absentee Votes (e.g. 80 + 5 = 85 voters → majority = 43)</w:t>
+      </w:r>
+    </w:p>
+    <w:p>
+      <w:pPr>
+        <w:pStyle w:val="ListBullet"/>
+        <w:spacing w:before="0" w:after="60"/>
+        <w:ind w:left="283"/>
+      </w:pPr>
+      <w:r>
+        <w:rPr>
+          <w:sz w:val="22"/>
+        </w:rPr>
+        <w:t>Round 2 and later use Expected Voters only (e.g. 80 voters → majority = 41), since absentee votes are only valid for Round 1</w:t>
+      </w:r>
+    </w:p>
+    <w:p>
+      <w:pPr>
+        <w:spacing w:before="0" w:after="100"/>
+      </w:pPr>
+      <w:r>
+        <w:rPr>
+          <w:sz w:val="22"/>
+        </w:rPr>
+        <w:t>When no absentee count is configured (0), a single majority number is displayed. When absentees are entered, both thresholds are shown side by side.</w:t>
       </w:r>
     </w:p>
     <w:tbl>
@@ -2564,6 +2785,54 @@
                 <w:sz w:val="20"/>
               </w:rPr>
               <w:t>Fields save automatically when you move to the next field. You can also click Save Details to save manually. A green "Saved" confirmation appears briefly.</w:t>
+            </w:r>
+          </w:p>
+        </w:tc>
+      </w:tr>
+    </w:tbl>
+    <w:p>
+      <w:pPr>
+        <w:spacing w:after="80"/>
+      </w:pPr>
+    </w:p>
+    <w:tbl>
+      <w:tblPr>
+        <w:tblStyle w:val="TableGrid"/>
+        <w:tblW w:type="auto" w:w="0"/>
+        <w:jc w:val="left"/>
+        <w:tblLook w:firstColumn="1" w:firstRow="1" w:lastColumn="0" w:lastRow="0" w:noHBand="0" w:noVBand="1" w:val="04A0"/>
+      </w:tblPr>
+      <w:tblGrid>
+        <w:gridCol w:w="9406"/>
+      </w:tblGrid>
+      <w:tr>
+        <w:tc>
+          <w:tcPr>
+            <w:tcW w:type="dxa" w:w="9406"/>
+            <w:shd w:val="clear" w:color="auto" w:fill="FFF4E0"/>
+            <w:tcBorders>
+              <w:top w:val="single" w:sz="12" w:space="0" w:color="B8942A"/>
+              <w:bottom w:val="single" w:sz="4" w:space="0" w:color="B8942A"/>
+              <w:left w:val="single" w:sz="12" w:space="0" w:color="B8942A"/>
+              <w:right w:val="single" w:sz="4" w:space="0" w:color="B8942A"/>
+            </w:tcBorders>
+          </w:tcPr>
+          <w:p>
+            <w:pPr>
+              <w:spacing w:before="40" w:after="40"/>
+            </w:pPr>
+            <w:r>
+              <w:rPr>
+                <w:b/>
+                <w:sz w:val="20"/>
+              </w:rPr>
+              <w:t xml:space="preserve">IMPORTANT:  </w:t>
+            </w:r>
+            <w:r>
+              <w:rPr>
+                <w:sz w:val="20"/>
+              </w:rPr>
+              <w:t>If absentee votes are being cast, enter the absentee count before the meeting begins. The majority threshold for Round 1 adjusts automatically as soon as the value is saved. The absentee ballots themselves are entered via Paper Ballot Entry with the Absentee checkbox.</w:t>
             </w:r>
           </w:p>
         </w:tc>
@@ -4392,7 +4661,7 @@
               <w:rPr>
                 <w:sz w:val="20"/>
               </w:rPr>
-              <w:t>Expected Voters</w:t>
+              <w:t>Absentee</w:t>
             </w:r>
           </w:p>
         </w:tc>
@@ -4409,7 +4678,7 @@
               <w:rPr>
                 <w:sz w:val="20"/>
               </w:rPr>
-              <w:t>The number configured in Election Setup Details tab</w:t>
+              <w:t>Number of paper ballots flagged as absentee this round (Round 1 only — stat box hidden in Round 2+)</w:t>
             </w:r>
           </w:p>
         </w:tc>
@@ -4428,7 +4697,7 @@
               <w:rPr>
                 <w:sz w:val="20"/>
               </w:rPr>
-              <w:t>Participation %</w:t>
+              <w:t>Expected Voters</w:t>
             </w:r>
           </w:p>
         </w:tc>
@@ -4436,6 +4705,42 @@
           <w:tcPr>
             <w:tcW w:type="dxa" w:w="6520"/>
             <w:shd w:val="clear" w:color="auto" w:fill="F8F6F1"/>
+          </w:tcPr>
+          <w:p>
+            <w:pPr>
+              <w:spacing w:before="40" w:after="40"/>
+            </w:pPr>
+            <w:r>
+              <w:rPr>
+                <w:sz w:val="20"/>
+              </w:rPr>
+              <w:t>Total eligible voters for this round: attending + absentee in Round 1; attending only in Round 2+</w:t>
+            </w:r>
+          </w:p>
+        </w:tc>
+      </w:tr>
+      <w:tr>
+        <w:tc>
+          <w:tcPr>
+            <w:tcW w:type="dxa" w:w="2551"/>
+            <w:shd w:val="clear" w:color="auto" w:fill="FFFFFF"/>
+          </w:tcPr>
+          <w:p>
+            <w:pPr>
+              <w:spacing w:before="40" w:after="40"/>
+            </w:pPr>
+            <w:r>
+              <w:rPr>
+                <w:sz w:val="20"/>
+              </w:rPr>
+              <w:t>Participation %</w:t>
+            </w:r>
+          </w:p>
+        </w:tc>
+        <w:tc>
+          <w:tcPr>
+            <w:tcW w:type="dxa" w:w="6520"/>
+            <w:shd w:val="clear" w:color="auto" w:fill="FFFFFF"/>
           </w:tcPr>
           <w:p>
             <w:pPr>
@@ -4709,7 +5014,44 @@
         <w:rPr>
           <w:sz w:val="22"/>
         </w:rPr>
-        <w:t>The system automatically detects candidates who received a majority of votes. Majority is defined as: floor(Expected Voters / 2) + 1 votes. Candidates meeting this threshold are pre-checked with a gold "majority" badge.</w:t>
+        <w:t>The system automatically detects candidates who received a majority of votes. The majority threshold is round-aware:</w:t>
+      </w:r>
+    </w:p>
+    <w:p>
+      <w:pPr>
+        <w:pStyle w:val="ListBullet"/>
+        <w:spacing w:before="0" w:after="60"/>
+        <w:ind w:left="283"/>
+      </w:pPr>
+      <w:r>
+        <w:rPr>
+          <w:sz w:val="22"/>
+        </w:rPr>
+        <w:t>Round 1: floor((Expected Voters + Absentee Votes) / 2) + 1</w:t>
+      </w:r>
+    </w:p>
+    <w:p>
+      <w:pPr>
+        <w:pStyle w:val="ListBullet"/>
+        <w:spacing w:before="0" w:after="60"/>
+        <w:ind w:left="283"/>
+      </w:pPr>
+      <w:r>
+        <w:rPr>
+          <w:sz w:val="22"/>
+        </w:rPr>
+        <w:t>Round 2 and later: floor(Expected Voters / 2) + 1</w:t>
+      </w:r>
+    </w:p>
+    <w:p>
+      <w:pPr>
+        <w:spacing w:before="0" w:after="100"/>
+      </w:pPr>
+      <w:r>
+        <w:rPr>
+          <w:sz w:val="22"/>
+        </w:rPr>
+        <w:t>Candidates meeting the threshold are pre-checked with a gold "majority" badge.</w:t>
       </w:r>
     </w:p>
     <w:tbl>
@@ -5531,6 +5873,19 @@
         <w:rPr>
           <w:sz w:val="22"/>
         </w:rPr>
+        <w:t>(Round 1 only) If the ballot is from an absentee voter, tick the "This is an absentee vote" checkbox before submitting.</w:t>
+      </w:r>
+    </w:p>
+    <w:p>
+      <w:pPr>
+        <w:pStyle w:val="ListNumber"/>
+        <w:spacing w:before="0" w:after="60"/>
+        <w:ind w:left="283"/>
+      </w:pPr>
+      <w:r>
+        <w:rPr>
+          <w:sz w:val="22"/>
+        </w:rPr>
         <w:t>Click Submit Paper Ballot. The vote is recorded immediately and the form resets.</w:t>
       </w:r>
     </w:p>
@@ -5758,6 +6113,327 @@
                 <w:sz w:val="20"/>
               </w:rPr>
               <w:t>Only the most recently submitted paper ballot can be deleted this way. To correct an earlier ballot, use the Edit button in the log.</w:t>
+            </w:r>
+          </w:p>
+        </w:tc>
+      </w:tr>
+    </w:tbl>
+    <w:p>
+      <w:pPr>
+        <w:spacing w:after="80"/>
+      </w:pPr>
+    </w:p>
+    <w:p>
+      <w:pPr>
+        <w:spacing w:before="240" w:after="80"/>
+      </w:pPr>
+      <w:r>
+        <w:rPr>
+          <w:b/>
+          <w:color w:val="1A2744"/>
+          <w:sz w:val="26"/>
+        </w:rPr>
+        <w:t>6e.  Absentee Votes</w:t>
+      </w:r>
+    </w:p>
+    <w:p>
+      <w:pPr>
+        <w:spacing w:before="0" w:after="100"/>
+      </w:pPr>
+      <w:r>
+        <w:rPr>
+          <w:sz w:val="22"/>
+        </w:rPr>
+        <w:t>Absentee votes are paper ballots received before the meeting from eligible members who cannot attend. They are counted only in Round 1 of each office.</w:t>
+      </w:r>
+    </w:p>
+    <w:tbl>
+      <w:tblPr>
+        <w:tblStyle w:val="TableGrid"/>
+        <w:tblW w:type="auto" w:w="0"/>
+        <w:jc w:val="left"/>
+        <w:tblLook w:firstColumn="1" w:firstRow="1" w:lastColumn="0" w:lastRow="0" w:noHBand="0" w:noVBand="1" w:val="04A0"/>
+      </w:tblPr>
+      <w:tblGrid>
+        <w:gridCol w:w="4703"/>
+        <w:gridCol w:w="4703"/>
+      </w:tblGrid>
+      <w:tr>
+        <w:tc>
+          <w:tcPr>
+            <w:tcW w:type="dxa" w:w="2268"/>
+            <w:shd w:val="clear" w:color="auto" w:fill="1A2744"/>
+          </w:tcPr>
+          <w:p>
+            <w:pPr>
+              <w:spacing w:before="40" w:after="40"/>
+            </w:pPr>
+            <w:r>
+              <w:rPr>
+                <w:b/>
+                <w:color w:val="FFFFFF"/>
+                <w:sz w:val="20"/>
+              </w:rPr>
+              <w:t>Step</w:t>
+            </w:r>
+          </w:p>
+        </w:tc>
+        <w:tc>
+          <w:tcPr>
+            <w:tcW w:type="dxa" w:w="6803"/>
+            <w:shd w:val="clear" w:color="auto" w:fill="1A2744"/>
+          </w:tcPr>
+          <w:p>
+            <w:pPr>
+              <w:spacing w:before="40" w:after="40"/>
+            </w:pPr>
+            <w:r>
+              <w:rPr>
+                <w:b/>
+                <w:color w:val="FFFFFF"/>
+                <w:sz w:val="20"/>
+              </w:rPr>
+              <w:t>Action</w:t>
+            </w:r>
+          </w:p>
+        </w:tc>
+      </w:tr>
+      <w:tr>
+        <w:tc>
+          <w:tcPr>
+            <w:tcW w:type="dxa" w:w="2268"/>
+            <w:shd w:val="clear" w:color="auto" w:fill="FFFFFF"/>
+          </w:tcPr>
+          <w:p>
+            <w:pPr>
+              <w:spacing w:before="40" w:after="40"/>
+            </w:pPr>
+            <w:r>
+              <w:rPr>
+                <w:sz w:val="20"/>
+              </w:rPr>
+              <w:t>Before the meeting</w:t>
+            </w:r>
+          </w:p>
+        </w:tc>
+        <w:tc>
+          <w:tcPr>
+            <w:tcW w:type="dxa" w:w="6803"/>
+            <w:shd w:val="clear" w:color="auto" w:fill="FFFFFF"/>
+          </w:tcPr>
+          <w:p>
+            <w:pPr>
+              <w:spacing w:before="40" w:after="40"/>
+            </w:pPr>
+            <w:r>
+              <w:rPr>
+                <w:sz w:val="20"/>
+              </w:rPr>
+              <w:t>Enter the total number of absentee ballots received in Election Setup → Details → "Absentee Votes (Round 1 only)". This adjusts the Round 1 majority threshold automatically.</w:t>
+            </w:r>
+          </w:p>
+        </w:tc>
+      </w:tr>
+      <w:tr>
+        <w:tc>
+          <w:tcPr>
+            <w:tcW w:type="dxa" w:w="2268"/>
+            <w:shd w:val="clear" w:color="auto" w:fill="F8F6F1"/>
+          </w:tcPr>
+          <w:p>
+            <w:pPr>
+              <w:spacing w:before="40" w:after="40"/>
+            </w:pPr>
+            <w:r>
+              <w:rPr>
+                <w:sz w:val="20"/>
+              </w:rPr>
+              <w:t>During Round 1 voting</w:t>
+            </w:r>
+          </w:p>
+        </w:tc>
+        <w:tc>
+          <w:tcPr>
+            <w:tcW w:type="dxa" w:w="6803"/>
+            <w:shd w:val="clear" w:color="auto" w:fill="F8F6F1"/>
+          </w:tcPr>
+          <w:p>
+            <w:pPr>
+              <w:spacing w:before="40" w:after="40"/>
+            </w:pPr>
+            <w:r>
+              <w:rPr>
+                <w:sz w:val="20"/>
+              </w:rPr>
+              <w:t>Enter each absentee ballot via Paper Ballot Entry. Tick the "This is an absentee vote" checkbox before clicking Submit.</w:t>
+            </w:r>
+          </w:p>
+        </w:tc>
+      </w:tr>
+      <w:tr>
+        <w:tc>
+          <w:tcPr>
+            <w:tcW w:type="dxa" w:w="2268"/>
+            <w:shd w:val="clear" w:color="auto" w:fill="FFFFFF"/>
+          </w:tcPr>
+          <w:p>
+            <w:pPr>
+              <w:spacing w:before="40" w:after="40"/>
+            </w:pPr>
+            <w:r>
+              <w:rPr>
+                <w:sz w:val="20"/>
+              </w:rPr>
+              <w:t>In the ballot log</w:t>
+            </w:r>
+          </w:p>
+        </w:tc>
+        <w:tc>
+          <w:tcPr>
+            <w:tcW w:type="dxa" w:w="6803"/>
+            <w:shd w:val="clear" w:color="auto" w:fill="FFFFFF"/>
+          </w:tcPr>
+          <w:p>
+            <w:pPr>
+              <w:spacing w:before="40" w:after="40"/>
+            </w:pPr>
+            <w:r>
+              <w:rPr>
+                <w:sz w:val="20"/>
+              </w:rPr>
+              <w:t>Each absentee ballot is tagged with a navy "Absentee" badge. A count summary ("Absentee ballots included: X") appears above the log.</w:t>
+            </w:r>
+          </w:p>
+        </w:tc>
+      </w:tr>
+      <w:tr>
+        <w:tc>
+          <w:tcPr>
+            <w:tcW w:type="dxa" w:w="2268"/>
+            <w:shd w:val="clear" w:color="auto" w:fill="F8F6F1"/>
+          </w:tcPr>
+          <w:p>
+            <w:pPr>
+              <w:spacing w:before="40" w:after="40"/>
+            </w:pPr>
+            <w:r>
+              <w:rPr>
+                <w:sz w:val="20"/>
+              </w:rPr>
+              <w:t>Round 2 and later</w:t>
+            </w:r>
+          </w:p>
+        </w:tc>
+        <w:tc>
+          <w:tcPr>
+            <w:tcW w:type="dxa" w:w="6803"/>
+            <w:shd w:val="clear" w:color="auto" w:fill="F8F6F1"/>
+          </w:tcPr>
+          <w:p>
+            <w:pPr>
+              <w:spacing w:before="40" w:after="40"/>
+            </w:pPr>
+            <w:r>
+              <w:rPr>
+                <w:sz w:val="20"/>
+              </w:rPr>
+              <w:t>The absentee checkbox is hidden. Absentee votes are not valid and must not be entered in Round 2 or later.</w:t>
+            </w:r>
+          </w:p>
+        </w:tc>
+      </w:tr>
+    </w:tbl>
+    <w:p>
+      <w:pPr>
+        <w:spacing w:after="120"/>
+      </w:pPr>
+    </w:p>
+    <w:tbl>
+      <w:tblPr>
+        <w:tblStyle w:val="TableGrid"/>
+        <w:tblW w:type="auto" w:w="0"/>
+        <w:jc w:val="left"/>
+        <w:tblLook w:firstColumn="1" w:firstRow="1" w:lastColumn="0" w:lastRow="0" w:noHBand="0" w:noVBand="1" w:val="04A0"/>
+      </w:tblPr>
+      <w:tblGrid>
+        <w:gridCol w:w="9406"/>
+      </w:tblGrid>
+      <w:tr>
+        <w:tc>
+          <w:tcPr>
+            <w:tcW w:type="dxa" w:w="9406"/>
+            <w:shd w:val="clear" w:color="auto" w:fill="FFF4E0"/>
+            <w:tcBorders>
+              <w:top w:val="single" w:sz="12" w:space="0" w:color="B8942A"/>
+              <w:bottom w:val="single" w:sz="4" w:space="0" w:color="B8942A"/>
+              <w:left w:val="single" w:sz="12" w:space="0" w:color="B8942A"/>
+              <w:right w:val="single" w:sz="4" w:space="0" w:color="B8942A"/>
+            </w:tcBorders>
+          </w:tcPr>
+          <w:p>
+            <w:pPr>
+              <w:spacing w:before="40" w:after="40"/>
+            </w:pPr>
+            <w:r>
+              <w:rPr>
+                <w:b/>
+                <w:sz w:val="20"/>
+              </w:rPr>
+              <w:t xml:space="preserve">IMPORTANT:  </w:t>
+            </w:r>
+            <w:r>
+              <w:rPr>
+                <w:sz w:val="20"/>
+              </w:rPr>
+              <w:t>Enter absentee ballots during the Round 1 voting period — the same as any other paper ballot. Do not enter absentee ballots in Round 2 or later rounds. The checkbox is hidden in those rounds as a safeguard, but the round should still be monitored carefully.</w:t>
+            </w:r>
+          </w:p>
+        </w:tc>
+      </w:tr>
+    </w:tbl>
+    <w:p>
+      <w:pPr>
+        <w:spacing w:after="80"/>
+      </w:pPr>
+    </w:p>
+    <w:tbl>
+      <w:tblPr>
+        <w:tblStyle w:val="TableGrid"/>
+        <w:tblW w:type="auto" w:w="0"/>
+        <w:jc w:val="left"/>
+        <w:tblLook w:firstColumn="1" w:firstRow="1" w:lastColumn="0" w:lastRow="0" w:noHBand="0" w:noVBand="1" w:val="04A0"/>
+      </w:tblPr>
+      <w:tblGrid>
+        <w:gridCol w:w="9406"/>
+      </w:tblGrid>
+      <w:tr>
+        <w:tc>
+          <w:tcPr>
+            <w:tcW w:type="dxa" w:w="9406"/>
+            <w:shd w:val="clear" w:color="auto" w:fill="E8F0FA"/>
+            <w:tcBorders>
+              <w:top w:val="single" w:sz="12" w:space="0" w:color="1A3A5C"/>
+              <w:bottom w:val="single" w:sz="4" w:space="0" w:color="1A3A5C"/>
+              <w:left w:val="single" w:sz="12" w:space="0" w:color="1A3A5C"/>
+              <w:right w:val="single" w:sz="4" w:space="0" w:color="1A3A5C"/>
+            </w:tcBorders>
+          </w:tcPr>
+          <w:p>
+            <w:pPr>
+              <w:spacing w:before="40" w:after="40"/>
+            </w:pPr>
+            <w:r>
+              <w:rPr>
+                <w:b/>
+                <w:sz w:val="20"/>
+              </w:rPr>
+              <w:t xml:space="preserve">NOTE:  </w:t>
+            </w:r>
+            <w:r>
+              <w:rPr>
+                <w:sz w:val="20"/>
+              </w:rPr>
+              <w:t>The number entered in "Absentee Votes" in Election Setup is only used to adjust the majority threshold. The system does not automatically add those votes — each absentee ballot must still be entered individually via Paper Ballot Entry with the absentee checkbox.</w:t>
             </w:r>
           </w:p>
         </w:tc>
@@ -8643,7 +9319,7 @@
         <w:rPr>
           <w:sz w:val="22"/>
         </w:rPr>
-        <w:t>This section walks through a realistic election: electing 2 Elders and 1 Deacon from a congregation with 80 eligible voters. Majority required = floor(80/2) + 1 = 41 votes.</w:t>
+        <w:t>This section walks through a realistic election: electing 2 Elders and 1 Deacon from a congregation with 80 eligible attending voters and 5 absentee ballots received. Round 1 majority = floor((80+5)/2) + 1 = 43. Round 2+ majority = floor(80/2) + 1 = 41.</w:t>
       </w:r>
     </w:p>
     <w:p>
@@ -8674,6 +9350,44 @@
       <w:tr>
         <w:tc>
           <w:tcPr>
+            <w:tcW w:type="dxa" w:w="2551"/>
+            <w:shd w:val="clear" w:color="auto" w:fill="1A2744"/>
+          </w:tcPr>
+          <w:p>
+            <w:pPr>
+              <w:spacing w:before="40" w:after="40"/>
+            </w:pPr>
+            <w:r>
+              <w:rPr>
+                <w:b/>
+                <w:color w:val="FFFFFF"/>
+                <w:sz w:val="20"/>
+              </w:rPr>
+              <w:t>Setting</w:t>
+            </w:r>
+          </w:p>
+        </w:tc>
+        <w:tc>
+          <w:tcPr>
+            <w:tcW w:type="dxa" w:w="4252"/>
+            <w:shd w:val="clear" w:color="auto" w:fill="1A2744"/>
+          </w:tcPr>
+          <w:p>
+            <w:pPr>
+              <w:spacing w:before="40" w:after="40"/>
+            </w:pPr>
+            <w:r>
+              <w:rPr>
+                <w:b/>
+                <w:color w:val="FFFFFF"/>
+                <w:sz w:val="20"/>
+              </w:rPr>
+              <w:t>Elder</w:t>
+            </w:r>
+          </w:p>
+        </w:tc>
+        <w:tc>
+          <w:tcPr>
             <w:tcW w:type="dxa" w:w="2268"/>
             <w:shd w:val="clear" w:color="auto" w:fill="1A2744"/>
           </w:tcPr>
@@ -8687,44 +9401,6 @@
                 <w:color w:val="FFFFFF"/>
                 <w:sz w:val="20"/>
               </w:rPr>
-              <w:t>Setting</w:t>
-            </w:r>
-          </w:p>
-        </w:tc>
-        <w:tc>
-          <w:tcPr>
-            <w:tcW w:type="dxa" w:w="4535"/>
-            <w:shd w:val="clear" w:color="auto" w:fill="1A2744"/>
-          </w:tcPr>
-          <w:p>
-            <w:pPr>
-              <w:spacing w:before="40" w:after="40"/>
-            </w:pPr>
-            <w:r>
-              <w:rPr>
-                <w:b/>
-                <w:color w:val="FFFFFF"/>
-                <w:sz w:val="20"/>
-              </w:rPr>
-              <w:t>Elder</w:t>
-            </w:r>
-          </w:p>
-        </w:tc>
-        <w:tc>
-          <w:tcPr>
-            <w:tcW w:type="dxa" w:w="2268"/>
-            <w:shd w:val="clear" w:color="auto" w:fill="1A2744"/>
-          </w:tcPr>
-          <w:p>
-            <w:pPr>
-              <w:spacing w:before="40" w:after="40"/>
-            </w:pPr>
-            <w:r>
-              <w:rPr>
-                <w:b/>
-                <w:color w:val="FFFFFF"/>
-                <w:sz w:val="20"/>
-              </w:rPr>
               <w:t>Deacon</w:t>
             </w:r>
           </w:p>
@@ -8733,6 +9409,40 @@
       <w:tr>
         <w:tc>
           <w:tcPr>
+            <w:tcW w:type="dxa" w:w="2551"/>
+            <w:shd w:val="clear" w:color="auto" w:fill="FFFFFF"/>
+          </w:tcPr>
+          <w:p>
+            <w:pPr>
+              <w:spacing w:before="40" w:after="40"/>
+            </w:pPr>
+            <w:r>
+              <w:rPr>
+                <w:sz w:val="20"/>
+              </w:rPr>
+              <w:t>Nominees</w:t>
+            </w:r>
+          </w:p>
+        </w:tc>
+        <w:tc>
+          <w:tcPr>
+            <w:tcW w:type="dxa" w:w="4252"/>
+            <w:shd w:val="clear" w:color="auto" w:fill="FFFFFF"/>
+          </w:tcPr>
+          <w:p>
+            <w:pPr>
+              <w:spacing w:before="40" w:after="40"/>
+            </w:pPr>
+            <w:r>
+              <w:rPr>
+                <w:sz w:val="20"/>
+              </w:rPr>
+              <w:t>John Smith, Peter Johnson, Michael Williams, David Brown</w:t>
+            </w:r>
+          </w:p>
+        </w:tc>
+        <w:tc>
+          <w:tcPr>
             <w:tcW w:type="dxa" w:w="2268"/>
             <w:shd w:val="clear" w:color="auto" w:fill="FFFFFF"/>
           </w:tcPr>
@@ -8744,13 +9454,68 @@
               <w:rPr>
                 <w:sz w:val="20"/>
               </w:rPr>
-              <w:t>Nominees</w:t>
-            </w:r>
-          </w:p>
-        </w:tc>
-        <w:tc>
-          <w:tcPr>
-            <w:tcW w:type="dxa" w:w="4535"/>
+              <w:t>Andrew Taylor, James Wilson, Robert Davis</w:t>
+            </w:r>
+          </w:p>
+        </w:tc>
+      </w:tr>
+      <w:tr>
+        <w:tc>
+          <w:tcPr>
+            <w:tcW w:type="dxa" w:w="2551"/>
+            <w:shd w:val="clear" w:color="auto" w:fill="F8F6F1"/>
+          </w:tcPr>
+          <w:p>
+            <w:pPr>
+              <w:spacing w:before="40" w:after="40"/>
+            </w:pPr>
+            <w:r>
+              <w:rPr>
+                <w:sz w:val="20"/>
+              </w:rPr>
+              <w:t>Positions</w:t>
+            </w:r>
+          </w:p>
+        </w:tc>
+        <w:tc>
+          <w:tcPr>
+            <w:tcW w:type="dxa" w:w="4252"/>
+            <w:shd w:val="clear" w:color="auto" w:fill="F8F6F1"/>
+          </w:tcPr>
+          <w:p>
+            <w:pPr>
+              <w:spacing w:before="40" w:after="40"/>
+            </w:pPr>
+            <w:r>
+              <w:rPr>
+                <w:sz w:val="20"/>
+              </w:rPr>
+              <w:t>2</w:t>
+            </w:r>
+          </w:p>
+        </w:tc>
+        <w:tc>
+          <w:tcPr>
+            <w:tcW w:type="dxa" w:w="2268"/>
+            <w:shd w:val="clear" w:color="auto" w:fill="F8F6F1"/>
+          </w:tcPr>
+          <w:p>
+            <w:pPr>
+              <w:spacing w:before="40" w:after="40"/>
+            </w:pPr>
+            <w:r>
+              <w:rPr>
+                <w:sz w:val="20"/>
+              </w:rPr>
+              <w:t>1</w:t>
+            </w:r>
+          </w:p>
+        </w:tc>
+      </w:tr>
+      <w:tr>
+        <w:tc>
+          <w:tcPr>
+            <w:tcW w:type="dxa" w:w="2551"/>
             <w:shd w:val="clear" w:color="auto" w:fill="FFFFFF"/>
           </w:tcPr>
           <w:p>
@@ -8761,7 +9526,24 @@
               <w:rPr>
                 <w:sz w:val="20"/>
               </w:rPr>
-              <w:t>John Smith, Peter Johnson, Michael Williams, David Brown</w:t>
+              <w:t>Votes per Voter</w:t>
+            </w:r>
+          </w:p>
+        </w:tc>
+        <w:tc>
+          <w:tcPr>
+            <w:tcW w:type="dxa" w:w="4252"/>
+            <w:shd w:val="clear" w:color="auto" w:fill="FFFFFF"/>
+          </w:tcPr>
+          <w:p>
+            <w:pPr>
+              <w:spacing w:before="40" w:after="40"/>
+            </w:pPr>
+            <w:r>
+              <w:rPr>
+                <w:sz w:val="20"/>
+              </w:rPr>
+              <w:t>2</w:t>
             </w:r>
           </w:p>
         </w:tc>
@@ -8778,7 +9560,7 @@
               <w:rPr>
                 <w:sz w:val="20"/>
               </w:rPr>
-              <w:t>Andrew Taylor, James Wilson, Robert Davis</w:t>
+              <w:t>1</w:t>
             </w:r>
           </w:p>
         </w:tc>
@@ -8786,6 +9568,40 @@
       <w:tr>
         <w:tc>
           <w:tcPr>
+            <w:tcW w:type="dxa" w:w="2551"/>
+            <w:shd w:val="clear" w:color="auto" w:fill="F8F6F1"/>
+          </w:tcPr>
+          <w:p>
+            <w:pPr>
+              <w:spacing w:before="40" w:after="40"/>
+            </w:pPr>
+            <w:r>
+              <w:rPr>
+                <w:sz w:val="20"/>
+              </w:rPr>
+              <w:t>Expected Voters (attending)</w:t>
+            </w:r>
+          </w:p>
+        </w:tc>
+        <w:tc>
+          <w:tcPr>
+            <w:tcW w:type="dxa" w:w="4252"/>
+            <w:shd w:val="clear" w:color="auto" w:fill="F8F6F1"/>
+          </w:tcPr>
+          <w:p>
+            <w:pPr>
+              <w:spacing w:before="40" w:after="40"/>
+            </w:pPr>
+            <w:r>
+              <w:rPr>
+                <w:sz w:val="20"/>
+              </w:rPr>
+              <w:t>80</w:t>
+            </w:r>
+          </w:p>
+        </w:tc>
+        <w:tc>
+          <w:tcPr>
             <w:tcW w:type="dxa" w:w="2268"/>
             <w:shd w:val="clear" w:color="auto" w:fill="F8F6F1"/>
           </w:tcPr>
@@ -8797,13 +9613,68 @@
               <w:rPr>
                 <w:sz w:val="20"/>
               </w:rPr>
-              <w:t>Positions</w:t>
-            </w:r>
-          </w:p>
-        </w:tc>
-        <w:tc>
-          <w:tcPr>
-            <w:tcW w:type="dxa" w:w="4535"/>
+              <w:t>80</w:t>
+            </w:r>
+          </w:p>
+        </w:tc>
+      </w:tr>
+      <w:tr>
+        <w:tc>
+          <w:tcPr>
+            <w:tcW w:type="dxa" w:w="2551"/>
+            <w:shd w:val="clear" w:color="auto" w:fill="FFFFFF"/>
+          </w:tcPr>
+          <w:p>
+            <w:pPr>
+              <w:spacing w:before="40" w:after="40"/>
+            </w:pPr>
+            <w:r>
+              <w:rPr>
+                <w:sz w:val="20"/>
+              </w:rPr>
+              <w:t>Absentee Votes</w:t>
+            </w:r>
+          </w:p>
+        </w:tc>
+        <w:tc>
+          <w:tcPr>
+            <w:tcW w:type="dxa" w:w="4252"/>
+            <w:shd w:val="clear" w:color="auto" w:fill="FFFFFF"/>
+          </w:tcPr>
+          <w:p>
+            <w:pPr>
+              <w:spacing w:before="40" w:after="40"/>
+            </w:pPr>
+            <w:r>
+              <w:rPr>
+                <w:sz w:val="20"/>
+              </w:rPr>
+              <w:t>5</w:t>
+            </w:r>
+          </w:p>
+        </w:tc>
+        <w:tc>
+          <w:tcPr>
+            <w:tcW w:type="dxa" w:w="2268"/>
+            <w:shd w:val="clear" w:color="auto" w:fill="FFFFFF"/>
+          </w:tcPr>
+          <w:p>
+            <w:pPr>
+              <w:spacing w:before="40" w:after="40"/>
+            </w:pPr>
+            <w:r>
+              <w:rPr>
+                <w:sz w:val="20"/>
+              </w:rPr>
+              <w:t>5</w:t>
+            </w:r>
+          </w:p>
+        </w:tc>
+      </w:tr>
+      <w:tr>
+        <w:tc>
+          <w:tcPr>
+            <w:tcW w:type="dxa" w:w="2551"/>
             <w:shd w:val="clear" w:color="auto" w:fill="F8F6F1"/>
           </w:tcPr>
           <w:p>
@@ -8814,7 +9685,24 @@
               <w:rPr>
                 <w:sz w:val="20"/>
               </w:rPr>
-              <w:t>2</w:t>
+              <w:t>Round 1 Majority Required</w:t>
+            </w:r>
+          </w:p>
+        </w:tc>
+        <w:tc>
+          <w:tcPr>
+            <w:tcW w:type="dxa" w:w="4252"/>
+            <w:shd w:val="clear" w:color="auto" w:fill="F8F6F1"/>
+          </w:tcPr>
+          <w:p>
+            <w:pPr>
+              <w:spacing w:before="40" w:after="40"/>
+            </w:pPr>
+            <w:r>
+              <w:rPr>
+                <w:sz w:val="20"/>
+              </w:rPr>
+              <w:t>43</w:t>
             </w:r>
           </w:p>
         </w:tc>
@@ -8831,7 +9719,7 @@
               <w:rPr>
                 <w:sz w:val="20"/>
               </w:rPr>
-              <w:t>1</w:t>
+              <w:t>43</w:t>
             </w:r>
           </w:p>
         </w:tc>
@@ -8839,7 +9727,7 @@
       <w:tr>
         <w:tc>
           <w:tcPr>
-            <w:tcW w:type="dxa" w:w="2268"/>
+            <w:tcW w:type="dxa" w:w="2551"/>
             <w:shd w:val="clear" w:color="auto" w:fill="FFFFFF"/>
           </w:tcPr>
           <w:p>
@@ -8850,119 +9738,13 @@
               <w:rPr>
                 <w:sz w:val="20"/>
               </w:rPr>
-              <w:t>Votes per Voter</w:t>
-            </w:r>
-          </w:p>
-        </w:tc>
-        <w:tc>
-          <w:tcPr>
-            <w:tcW w:type="dxa" w:w="4535"/>
-            <w:shd w:val="clear" w:color="auto" w:fill="FFFFFF"/>
-          </w:tcPr>
-          <w:p>
-            <w:pPr>
-              <w:spacing w:before="40" w:after="40"/>
-            </w:pPr>
-            <w:r>
-              <w:rPr>
-                <w:sz w:val="20"/>
-              </w:rPr>
-              <w:t>2</w:t>
-            </w:r>
-          </w:p>
-        </w:tc>
-        <w:tc>
-          <w:tcPr>
-            <w:tcW w:type="dxa" w:w="2268"/>
-            <w:shd w:val="clear" w:color="auto" w:fill="FFFFFF"/>
-          </w:tcPr>
-          <w:p>
-            <w:pPr>
-              <w:spacing w:before="40" w:after="40"/>
-            </w:pPr>
-            <w:r>
-              <w:rPr>
-                <w:sz w:val="20"/>
-              </w:rPr>
-              <w:t>1</w:t>
-            </w:r>
-          </w:p>
-        </w:tc>
-      </w:tr>
-      <w:tr>
-        <w:tc>
-          <w:tcPr>
-            <w:tcW w:type="dxa" w:w="2268"/>
-            <w:shd w:val="clear" w:color="auto" w:fill="F8F6F1"/>
-          </w:tcPr>
-          <w:p>
-            <w:pPr>
-              <w:spacing w:before="40" w:after="40"/>
-            </w:pPr>
-            <w:r>
-              <w:rPr>
-                <w:sz w:val="20"/>
-              </w:rPr>
-              <w:t>Expected Voters</w:t>
-            </w:r>
-          </w:p>
-        </w:tc>
-        <w:tc>
-          <w:tcPr>
-            <w:tcW w:type="dxa" w:w="4535"/>
-            <w:shd w:val="clear" w:color="auto" w:fill="F8F6F1"/>
-          </w:tcPr>
-          <w:p>
-            <w:pPr>
-              <w:spacing w:before="40" w:after="40"/>
-            </w:pPr>
-            <w:r>
-              <w:rPr>
-                <w:sz w:val="20"/>
-              </w:rPr>
-              <w:t>80</w:t>
-            </w:r>
-          </w:p>
-        </w:tc>
-        <w:tc>
-          <w:tcPr>
-            <w:tcW w:type="dxa" w:w="2268"/>
-            <w:shd w:val="clear" w:color="auto" w:fill="F8F6F1"/>
-          </w:tcPr>
-          <w:p>
-            <w:pPr>
-              <w:spacing w:before="40" w:after="40"/>
-            </w:pPr>
-            <w:r>
-              <w:rPr>
-                <w:sz w:val="20"/>
-              </w:rPr>
-              <w:t>80</w:t>
-            </w:r>
-          </w:p>
-        </w:tc>
-      </w:tr>
-      <w:tr>
-        <w:tc>
-          <w:tcPr>
-            <w:tcW w:type="dxa" w:w="2268"/>
-            <w:shd w:val="clear" w:color="auto" w:fill="FFFFFF"/>
-          </w:tcPr>
-          <w:p>
-            <w:pPr>
-              <w:spacing w:before="40" w:after="40"/>
-            </w:pPr>
-            <w:r>
-              <w:rPr>
-                <w:sz w:val="20"/>
-              </w:rPr>
-              <w:t>Majority Required</w:t>
-            </w:r>
-          </w:p>
-        </w:tc>
-        <w:tc>
-          <w:tcPr>
-            <w:tcW w:type="dxa" w:w="4535"/>
+              <w:t>Round 2+ Majority Required</w:t>
+            </w:r>
+          </w:p>
+        </w:tc>
+        <w:tc>
+          <w:tcPr>
+            <w:tcW w:type="dxa" w:w="4252"/>
             <w:shd w:val="clear" w:color="auto" w:fill="FFFFFF"/>
           </w:tcPr>
           <w:p>
@@ -9063,7 +9845,7 @@
         <w:rPr>
           <w:sz w:val="22"/>
         </w:rPr>
-        <w:t>Details tab: enter congregation name, meeting date, Expected Voters = 80.</w:t>
+        <w:t>Details tab: enter congregation name, meeting date, Expected Voters = 80, Absentee Votes = 5. Save.</w:t>
       </w:r>
     </w:p>
     <w:p>
@@ -9193,7 +9975,7 @@
         <w:rPr>
           <w:sz w:val="22"/>
         </w:rPr>
-        <w:t>Paper ballot volunteer enters paper ballots via Paper Ballot Entry.</w:t>
+        <w:t>Paper ballot volunteer enters the 5 absentee ballots first (each with the Absentee checkbox ticked), then any remaining paper ballots.</w:t>
       </w:r>
     </w:p>
     <w:p>
@@ -9217,7 +9999,7 @@
         <w:rPr>
           <w:sz w:val="22"/>
         </w:rPr>
-        <w:t>Example results (75 ballots cast; majority = 41):</w:t>
+        <w:t>Example results (75 ballots cast incl. 5 absentee; Round 1 majority = 43):</w:t>
       </w:r>
     </w:p>
     <w:tbl>
@@ -9274,7 +10056,7 @@
         </w:tc>
         <w:tc>
           <w:tcPr>
-            <w:tcW w:type="dxa" w:w="2268"/>
+            <w:tcW w:type="dxa" w:w="2551"/>
             <w:shd w:val="clear" w:color="auto" w:fill="1A2744"/>
           </w:tcPr>
           <w:p>
@@ -9287,13 +10069,13 @@
                 <w:color w:val="FFFFFF"/>
                 <w:sz w:val="20"/>
               </w:rPr>
-              <w:t>Majority (≥ 41)?</w:t>
-            </w:r>
-          </w:p>
-        </w:tc>
-        <w:tc>
-          <w:tcPr>
-            <w:tcW w:type="dxa" w:w="2835"/>
+              <w:t>Majority (≥ 43)?</w:t>
+            </w:r>
+          </w:p>
+        </w:tc>
+        <w:tc>
+          <w:tcPr>
+            <w:tcW w:type="dxa" w:w="2551"/>
             <w:shd w:val="clear" w:color="auto" w:fill="1A2744"/>
           </w:tcPr>
           <w:p>
@@ -9348,7 +10130,7 @@
         </w:tc>
         <w:tc>
           <w:tcPr>
-            <w:tcW w:type="dxa" w:w="2268"/>
+            <w:tcW w:type="dxa" w:w="2551"/>
             <w:shd w:val="clear" w:color="auto" w:fill="FFFFFF"/>
           </w:tcPr>
           <w:p>
@@ -9365,7 +10147,7 @@
         </w:tc>
         <w:tc>
           <w:tcPr>
-            <w:tcW w:type="dxa" w:w="2835"/>
+            <w:tcW w:type="dxa" w:w="2551"/>
             <w:shd w:val="clear" w:color="auto" w:fill="FFFFFF"/>
           </w:tcPr>
           <w:p>
@@ -9418,7 +10200,7 @@
         </w:tc>
         <w:tc>
           <w:tcPr>
-            <w:tcW w:type="dxa" w:w="2268"/>
+            <w:tcW w:type="dxa" w:w="2551"/>
             <w:shd w:val="clear" w:color="auto" w:fill="F8F6F1"/>
           </w:tcPr>
           <w:p>
@@ -9435,7 +10217,7 @@
         </w:tc>
         <w:tc>
           <w:tcPr>
-            <w:tcW w:type="dxa" w:w="2835"/>
+            <w:tcW w:type="dxa" w:w="2551"/>
             <w:shd w:val="clear" w:color="auto" w:fill="F8F6F1"/>
           </w:tcPr>
           <w:p>
@@ -9488,7 +10270,7 @@
         </w:tc>
         <w:tc>
           <w:tcPr>
-            <w:tcW w:type="dxa" w:w="2268"/>
+            <w:tcW w:type="dxa" w:w="2551"/>
             <w:shd w:val="clear" w:color="auto" w:fill="FFFFFF"/>
           </w:tcPr>
           <w:p>
@@ -9505,7 +10287,7 @@
         </w:tc>
         <w:tc>
           <w:tcPr>
-            <w:tcW w:type="dxa" w:w="2835"/>
+            <w:tcW w:type="dxa" w:w="2551"/>
             <w:shd w:val="clear" w:color="auto" w:fill="FFFFFF"/>
           </w:tcPr>
           <w:p>
@@ -9558,7 +10340,7 @@
         </w:tc>
         <w:tc>
           <w:tcPr>
-            <w:tcW w:type="dxa" w:w="2268"/>
+            <w:tcW w:type="dxa" w:w="2551"/>
             <w:shd w:val="clear" w:color="auto" w:fill="F8F6F1"/>
           </w:tcPr>
           <w:p>
@@ -9575,7 +10357,7 @@
         </w:tc>
         <w:tc>
           <w:tcPr>
-            <w:tcW w:type="dxa" w:w="2835"/>
+            <w:tcW w:type="dxa" w:w="2551"/>
             <w:shd w:val="clear" w:color="auto" w:fill="F8F6F1"/>
           </w:tcPr>
           <w:p>
@@ -9735,7 +10517,7 @@
         <w:rPr>
           <w:sz w:val="22"/>
         </w:rPr>
-        <w:t>Example results (72 ballots cast; majority = 41):</w:t>
+        <w:t>Example results (72 ballots cast incl. 5 absentee; Round 1 majority = 43):</w:t>
       </w:r>
     </w:p>
     <w:tbl>
@@ -9792,7 +10574,7 @@
         </w:tc>
         <w:tc>
           <w:tcPr>
-            <w:tcW w:type="dxa" w:w="2268"/>
+            <w:tcW w:type="dxa" w:w="2551"/>
             <w:shd w:val="clear" w:color="auto" w:fill="1A2744"/>
           </w:tcPr>
           <w:p>
@@ -9805,13 +10587,13 @@
                 <w:color w:val="FFFFFF"/>
                 <w:sz w:val="20"/>
               </w:rPr>
-              <w:t>Majority (≥ 41)?</w:t>
-            </w:r>
-          </w:p>
-        </w:tc>
-        <w:tc>
-          <w:tcPr>
-            <w:tcW w:type="dxa" w:w="2835"/>
+              <w:t>Majority (≥ 43)?</w:t>
+            </w:r>
+          </w:p>
+        </w:tc>
+        <w:tc>
+          <w:tcPr>
+            <w:tcW w:type="dxa" w:w="2551"/>
             <w:shd w:val="clear" w:color="auto" w:fill="1A2744"/>
           </w:tcPr>
           <w:p>
@@ -9866,7 +10648,7 @@
         </w:tc>
         <w:tc>
           <w:tcPr>
-            <w:tcW w:type="dxa" w:w="2268"/>
+            <w:tcW w:type="dxa" w:w="2551"/>
             <w:shd w:val="clear" w:color="auto" w:fill="FFFFFF"/>
           </w:tcPr>
           <w:p>
@@ -9883,7 +10665,7 @@
         </w:tc>
         <w:tc>
           <w:tcPr>
-            <w:tcW w:type="dxa" w:w="2835"/>
+            <w:tcW w:type="dxa" w:w="2551"/>
             <w:shd w:val="clear" w:color="auto" w:fill="FFFFFF"/>
           </w:tcPr>
           <w:p>
@@ -9936,7 +10718,7 @@
         </w:tc>
         <w:tc>
           <w:tcPr>
-            <w:tcW w:type="dxa" w:w="2268"/>
+            <w:tcW w:type="dxa" w:w="2551"/>
             <w:shd w:val="clear" w:color="auto" w:fill="F8F6F1"/>
           </w:tcPr>
           <w:p>
@@ -9953,7 +10735,7 @@
         </w:tc>
         <w:tc>
           <w:tcPr>
-            <w:tcW w:type="dxa" w:w="2835"/>
+            <w:tcW w:type="dxa" w:w="2551"/>
             <w:shd w:val="clear" w:color="auto" w:fill="F8F6F1"/>
           </w:tcPr>
           <w:p>
@@ -10006,7 +10788,7 @@
         </w:tc>
         <w:tc>
           <w:tcPr>
-            <w:tcW w:type="dxa" w:w="2268"/>
+            <w:tcW w:type="dxa" w:w="2551"/>
             <w:shd w:val="clear" w:color="auto" w:fill="FFFFFF"/>
           </w:tcPr>
           <w:p>
@@ -10023,7 +10805,7 @@
         </w:tc>
         <w:tc>
           <w:tcPr>
-            <w:tcW w:type="dxa" w:w="2835"/>
+            <w:tcW w:type="dxa" w:w="2551"/>
             <w:shd w:val="clear" w:color="auto" w:fill="FFFFFF"/>
           </w:tcPr>
           <w:p>
@@ -10053,7 +10835,7 @@
         <w:rPr>
           <w:sz w:val="22"/>
         </w:rPr>
-        <w:t>No majority reached — a second round is needed.</w:t>
+        <w:t>No majority reached — a second round is needed. Note that Round 2 majority drops to 41 (attending voters only, no absentees).</w:t>
       </w:r>
     </w:p>
     <w:p>
@@ -10142,7 +10924,7 @@
         <w:rPr>
           <w:sz w:val="22"/>
         </w:rPr>
-        <w:t>Example results (70 ballots cast; majority = 41):</w:t>
+        <w:t>Example results (70 ballots cast; Round 2 majority = 41 — attending voters only, no absentees):</w:t>
       </w:r>
     </w:p>
     <w:tbl>
@@ -10199,7 +10981,7 @@
         </w:tc>
         <w:tc>
           <w:tcPr>
-            <w:tcW w:type="dxa" w:w="2268"/>
+            <w:tcW w:type="dxa" w:w="2551"/>
             <w:shd w:val="clear" w:color="auto" w:fill="1A2744"/>
           </w:tcPr>
           <w:p>
@@ -10218,7 +11000,7 @@
         </w:tc>
         <w:tc>
           <w:tcPr>
-            <w:tcW w:type="dxa" w:w="2835"/>
+            <w:tcW w:type="dxa" w:w="2551"/>
             <w:shd w:val="clear" w:color="auto" w:fill="1A2744"/>
           </w:tcPr>
           <w:p>
@@ -10273,7 +11055,7 @@
         </w:tc>
         <w:tc>
           <w:tcPr>
-            <w:tcW w:type="dxa" w:w="2268"/>
+            <w:tcW w:type="dxa" w:w="2551"/>
             <w:shd w:val="clear" w:color="auto" w:fill="FFFFFF"/>
           </w:tcPr>
           <w:p>
@@ -10290,7 +11072,7 @@
         </w:tc>
         <w:tc>
           <w:tcPr>
-            <w:tcW w:type="dxa" w:w="2835"/>
+            <w:tcW w:type="dxa" w:w="2551"/>
             <w:shd w:val="clear" w:color="auto" w:fill="FFFFFF"/>
           </w:tcPr>
           <w:p>
@@ -10343,7 +11125,7 @@
         </w:tc>
         <w:tc>
           <w:tcPr>
-            <w:tcW w:type="dxa" w:w="2268"/>
+            <w:tcW w:type="dxa" w:w="2551"/>
             <w:shd w:val="clear" w:color="auto" w:fill="F8F6F1"/>
           </w:tcPr>
           <w:p>
@@ -10360,7 +11142,7 @@
         </w:tc>
         <w:tc>
           <w:tcPr>
-            <w:tcW w:type="dxa" w:w="2835"/>
+            <w:tcW w:type="dxa" w:w="2551"/>
             <w:shd w:val="clear" w:color="auto" w:fill="F8F6F1"/>
           </w:tcPr>
           <w:p>
@@ -11834,7 +12616,7 @@
               <w:rPr>
                 <w:sz w:val="20"/>
               </w:rPr>
-              <w:t>Expected Voters</w:t>
+              <w:t>Expected Voters (attending)</w:t>
             </w:r>
           </w:p>
         </w:tc>
@@ -11870,7 +12652,7 @@
               <w:rPr>
                 <w:sz w:val="20"/>
               </w:rPr>
-              <w:t>Majority Required</w:t>
+              <w:t>Absentee Votes (Round 1 only)</w:t>
             </w:r>
           </w:p>
         </w:tc>
@@ -11887,7 +12669,115 @@
               <w:rPr>
                 <w:sz w:val="20"/>
               </w:rPr>
-              <w:t>floor(Expected Voters / 2) + 1  =  ________</w:t>
+              <w:t>________</w:t>
+            </w:r>
+          </w:p>
+        </w:tc>
+      </w:tr>
+      <w:tr>
+        <w:tc>
+          <w:tcPr>
+            <w:tcW w:type="dxa" w:w="3118"/>
+            <w:shd w:val="clear" w:color="auto" w:fill="FFFFFF"/>
+          </w:tcPr>
+          <w:p>
+            <w:pPr>
+              <w:spacing w:before="40" w:after="40"/>
+            </w:pPr>
+            <w:r>
+              <w:rPr>
+                <w:sz w:val="20"/>
+              </w:rPr>
+              <w:t>Round 1 Total Voters</w:t>
+            </w:r>
+          </w:p>
+        </w:tc>
+        <w:tc>
+          <w:tcPr>
+            <w:tcW w:type="dxa" w:w="5953"/>
+            <w:shd w:val="clear" w:color="auto" w:fill="FFFFFF"/>
+          </w:tcPr>
+          <w:p>
+            <w:pPr>
+              <w:spacing w:before="40" w:after="40"/>
+            </w:pPr>
+            <w:r>
+              <w:rPr>
+                <w:sz w:val="20"/>
+              </w:rPr>
+              <w:t>Attending + Absentee  =  ________</w:t>
+            </w:r>
+          </w:p>
+        </w:tc>
+      </w:tr>
+      <w:tr>
+        <w:tc>
+          <w:tcPr>
+            <w:tcW w:type="dxa" w:w="3118"/>
+            <w:shd w:val="clear" w:color="auto" w:fill="F8F6F1"/>
+          </w:tcPr>
+          <w:p>
+            <w:pPr>
+              <w:spacing w:before="40" w:after="40"/>
+            </w:pPr>
+            <w:r>
+              <w:rPr>
+                <w:sz w:val="20"/>
+              </w:rPr>
+              <w:t>Round 1 Majority Required</w:t>
+            </w:r>
+          </w:p>
+        </w:tc>
+        <w:tc>
+          <w:tcPr>
+            <w:tcW w:type="dxa" w:w="5953"/>
+            <w:shd w:val="clear" w:color="auto" w:fill="F8F6F1"/>
+          </w:tcPr>
+          <w:p>
+            <w:pPr>
+              <w:spacing w:before="40" w:after="40"/>
+            </w:pPr>
+            <w:r>
+              <w:rPr>
+                <w:sz w:val="20"/>
+              </w:rPr>
+              <w:t>floor(Round 1 Total / 2) + 1  =  ________</w:t>
+            </w:r>
+          </w:p>
+        </w:tc>
+      </w:tr>
+      <w:tr>
+        <w:tc>
+          <w:tcPr>
+            <w:tcW w:type="dxa" w:w="3118"/>
+            <w:shd w:val="clear" w:color="auto" w:fill="FFFFFF"/>
+          </w:tcPr>
+          <w:p>
+            <w:pPr>
+              <w:spacing w:before="40" w:after="40"/>
+            </w:pPr>
+            <w:r>
+              <w:rPr>
+                <w:sz w:val="20"/>
+              </w:rPr>
+              <w:t>Round 2+ Majority Required</w:t>
+            </w:r>
+          </w:p>
+        </w:tc>
+        <w:tc>
+          <w:tcPr>
+            <w:tcW w:type="dxa" w:w="5953"/>
+            <w:shd w:val="clear" w:color="auto" w:fill="FFFFFF"/>
+          </w:tcPr>
+          <w:p>
+            <w:pPr>
+              <w:spacing w:before="40" w:after="40"/>
+            </w:pPr>
+            <w:r>
+              <w:rPr>
+                <w:sz w:val="20"/>
+              </w:rPr>
+              <w:t>floor(Attending / 2) + 1  =  ________</w:t>
             </w:r>
           </w:p>
         </w:tc>
@@ -12563,7 +13453,7 @@
         <w:rPr>
           <w:sz w:val="22"/>
         </w:rPr>
-        <w:t>☐   Congregation name, meeting date, and Expected Voters saved</w:t>
+        <w:t>☐   Congregation name, meeting date, Expected Voters, and Absentee Votes saved</w:t>
       </w:r>
     </w:p>
     <w:p>
@@ -12664,7 +13554,7 @@
           <w:color w:val="666666"/>
           <w:sz w:val="18"/>
         </w:rPr>
-        <w:t>Church Office Bearer Election System — User Manual</w:t>
+        <w:t>Church Office Bearer Election System — User Manual  |  Version 1.1.0</w:t>
         <w:br/>
         <w:t>All data is stored on the local server. No votes leave the meeting network.</w:t>
       </w:r>

</xml_diff>

<commit_message>
Update manual to v1.1.1 — dashboard majority pill and round results
Section 8 (Election Dashboard) updates:
- Status section table: added Majority Required row describing the
  round-aware pill shown next to the voting status
- Results section: expanded with two sub-sections — active round
  behaviour and the new "Awaiting transition" card that appears
  immediately after End Round with full vote counts, bars, and
  majority badges; includes tip for chairman use
- Cover and footer version bumped to 1.1.1

Co-Authored-By: Claude Sonnet 4.6 <noreply@anthropic.com>
</commit_message>
<xml_diff>
--- a/manual.docx
+++ b/manual.docx
@@ -41,7 +41,7 @@
           <w:color w:val="666666"/>
           <w:sz w:val="22"/>
         </w:rPr>
-        <w:t>Version 1.1.0</w:t>
+        <w:t>Version 1.1.1</w:t>
       </w:r>
     </w:p>
     <w:p>
@@ -7671,7 +7671,7 @@
       <w:tr>
         <w:tc>
           <w:tcPr>
-            <w:tcW w:type="dxa" w:w="2835"/>
+            <w:tcW w:type="dxa" w:w="2551"/>
             <w:shd w:val="clear" w:color="auto" w:fill="1A2744"/>
           </w:tcPr>
           <w:p>
@@ -7690,7 +7690,7 @@
         </w:tc>
         <w:tc>
           <w:tcPr>
-            <w:tcW w:type="dxa" w:w="6236"/>
+            <w:tcW w:type="dxa" w:w="6520"/>
             <w:shd w:val="clear" w:color="auto" w:fill="1A2744"/>
           </w:tcPr>
           <w:p>
@@ -7711,7 +7711,7 @@
       <w:tr>
         <w:tc>
           <w:tcPr>
-            <w:tcW w:type="dxa" w:w="2835"/>
+            <w:tcW w:type="dxa" w:w="2551"/>
             <w:shd w:val="clear" w:color="auto" w:fill="FFFFFF"/>
           </w:tcPr>
           <w:p>
@@ -7728,7 +7728,7 @@
         </w:tc>
         <w:tc>
           <w:tcPr>
-            <w:tcW w:type="dxa" w:w="6236"/>
+            <w:tcW w:type="dxa" w:w="6520"/>
             <w:shd w:val="clear" w:color="auto" w:fill="FFFFFF"/>
           </w:tcPr>
           <w:p>
@@ -7747,7 +7747,7 @@
       <w:tr>
         <w:tc>
           <w:tcPr>
-            <w:tcW w:type="dxa" w:w="2835"/>
+            <w:tcW w:type="dxa" w:w="2551"/>
             <w:shd w:val="clear" w:color="auto" w:fill="F8F6F1"/>
           </w:tcPr>
           <w:p>
@@ -7764,7 +7764,7 @@
         </w:tc>
         <w:tc>
           <w:tcPr>
-            <w:tcW w:type="dxa" w:w="6236"/>
+            <w:tcW w:type="dxa" w:w="6520"/>
             <w:shd w:val="clear" w:color="auto" w:fill="F8F6F1"/>
           </w:tcPr>
           <w:p>
@@ -7783,7 +7783,7 @@
       <w:tr>
         <w:tc>
           <w:tcPr>
-            <w:tcW w:type="dxa" w:w="2835"/>
+            <w:tcW w:type="dxa" w:w="2551"/>
             <w:shd w:val="clear" w:color="auto" w:fill="FFFFFF"/>
           </w:tcPr>
           <w:p>
@@ -7794,13 +7794,13 @@
               <w:rPr>
                 <w:sz w:val="20"/>
               </w:rPr>
-              <w:t>Votes per Voter</w:t>
-            </w:r>
-          </w:p>
-        </w:tc>
-        <w:tc>
-          <w:tcPr>
-            <w:tcW w:type="dxa" w:w="6236"/>
+              <w:t>Majority Required</w:t>
+            </w:r>
+          </w:p>
+        </w:tc>
+        <w:tc>
+          <w:tcPr>
+            <w:tcW w:type="dxa" w:w="6520"/>
             <w:shd w:val="clear" w:color="auto" w:fill="FFFFFF"/>
           </w:tcPr>
           <w:p>
@@ -7811,7 +7811,7 @@
               <w:rPr>
                 <w:sz w:val="20"/>
               </w:rPr>
-              <w:t>How many candidates each voter may select in the current round</w:t>
+              <w:t>Pill showing the minimum votes needed for election in the current round. Round 1 uses attending + absentee voters; Round 2+ uses attending voters only.</w:t>
             </w:r>
           </w:p>
         </w:tc>
@@ -7819,7 +7819,7 @@
       <w:tr>
         <w:tc>
           <w:tcPr>
-            <w:tcW w:type="dxa" w:w="2835"/>
+            <w:tcW w:type="dxa" w:w="2551"/>
             <w:shd w:val="clear" w:color="auto" w:fill="F8F6F1"/>
           </w:tcPr>
           <w:p>
@@ -7830,14 +7830,50 @@
               <w:rPr>
                 <w:sz w:val="20"/>
               </w:rPr>
+              <w:t>Votes per Voter</w:t>
+            </w:r>
+          </w:p>
+        </w:tc>
+        <w:tc>
+          <w:tcPr>
+            <w:tcW w:type="dxa" w:w="6520"/>
+            <w:shd w:val="clear" w:color="auto" w:fill="F8F6F1"/>
+          </w:tcPr>
+          <w:p>
+            <w:pPr>
+              <w:spacing w:before="40" w:after="40"/>
+            </w:pPr>
+            <w:r>
+              <w:rPr>
+                <w:sz w:val="20"/>
+              </w:rPr>
+              <w:t>How many candidates each voter may select in the current round</w:t>
+            </w:r>
+          </w:p>
+        </w:tc>
+      </w:tr>
+      <w:tr>
+        <w:tc>
+          <w:tcPr>
+            <w:tcW w:type="dxa" w:w="2551"/>
+            <w:shd w:val="clear" w:color="auto" w:fill="FFFFFF"/>
+          </w:tcPr>
+          <w:p>
+            <w:pPr>
+              <w:spacing w:before="40" w:after="40"/>
+            </w:pPr>
+            <w:r>
+              <w:rPr>
+                <w:sz w:val="20"/>
+              </w:rPr>
               <w:t>Candidates This Round</w:t>
             </w:r>
           </w:p>
         </w:tc>
         <w:tc>
           <w:tcPr>
-            <w:tcW w:type="dxa" w:w="6236"/>
-            <w:shd w:val="clear" w:color="auto" w:fill="F8F6F1"/>
+            <w:tcW w:type="dxa" w:w="6520"/>
+            <w:shd w:val="clear" w:color="auto" w:fill="FFFFFF"/>
           </w:tcPr>
           <w:p>
             <w:pPr>
@@ -7879,7 +7915,20 @@
         <w:rPr>
           <w:sz w:val="22"/>
         </w:rPr>
-        <w:t>For each configured office, all candidates are listed with:</w:t>
+        <w:t>For each configured office the results section shows all candidates. The content adapts to the current state of the election:</w:t>
+      </w:r>
+    </w:p>
+    <w:p>
+      <w:pPr>
+        <w:spacing w:before="160" w:after="60"/>
+      </w:pPr>
+      <w:r>
+        <w:rPr>
+          <w:b/>
+          <w:color w:val="666666"/>
+          <w:sz w:val="20"/>
+        </w:rPr>
+        <w:t>DURING AN ACTIVE ROUND (VOTING OPEN OR CLOSED)</w:t>
       </w:r>
     </w:p>
     <w:p>
@@ -7892,7 +7941,7 @@
         <w:rPr>
           <w:sz w:val="22"/>
         </w:rPr>
-        <w:t>Their total vote count across all rounds</w:t>
+        <w:t>All candidates listed with vote counts and proportional bars</w:t>
       </w:r>
     </w:p>
     <w:p>
@@ -7905,7 +7954,7 @@
         <w:rPr>
           <w:sz w:val="22"/>
         </w:rPr>
-        <w:t>A proportional bar chart showing relative vote share</w:t>
+        <w:t>"✓ Elected · Rd X" badge on previously elected candidates</w:t>
       </w:r>
     </w:p>
     <w:p>
@@ -7918,7 +7967,31 @@
         <w:rPr>
           <w:sz w:val="22"/>
         </w:rPr>
-        <w:t>"✓ Elected · Rd X" badge if elected in a given round</w:t>
+        <w:t>"Not elected" label on candidates who did not receive enough votes in a completed round</w:t>
+      </w:r>
+    </w:p>
+    <w:p>
+      <w:pPr>
+        <w:spacing w:before="160" w:after="60"/>
+      </w:pPr>
+      <w:r>
+        <w:rPr>
+          <w:b/>
+          <w:color w:val="666666"/>
+          <w:sz w:val="20"/>
+        </w:rPr>
+        <w:t>IMMEDIATELY AFTER ENDING A ROUND (AWAITING TRANSITION)</w:t>
+      </w:r>
+    </w:p>
+    <w:p>
+      <w:pPr>
+        <w:spacing w:before="0" w:after="100"/>
+      </w:pPr>
+      <w:r>
+        <w:rPr>
+          <w:sz w:val="22"/>
+        </w:rPr>
+        <w:t>As soon as the election officer clicks End Round, a green "Round N Results — Awaiting transition" card appears at the top of the office section before the election officer has processed the Round Transition screen. This card shows:</w:t>
       </w:r>
     </w:p>
     <w:p>
@@ -7931,8 +8004,106 @@
         <w:rPr>
           <w:sz w:val="22"/>
         </w:rPr>
-        <w:t>"Not elected" label for candidates who were not elected</w:t>
-      </w:r>
+        <w:t>All candidates ranked by votes received in that round, with full vote counts and proportional bars</w:t>
+      </w:r>
+    </w:p>
+    <w:p>
+      <w:pPr>
+        <w:pStyle w:val="ListBullet"/>
+        <w:spacing w:before="0" w:after="60"/>
+        <w:ind w:left="283"/>
+      </w:pPr>
+      <w:r>
+        <w:rPr>
+          <w:sz w:val="22"/>
+        </w:rPr>
+        <w:t>Total ballot count and majority required for that round</w:t>
+      </w:r>
+    </w:p>
+    <w:p>
+      <w:pPr>
+        <w:pStyle w:val="ListBullet"/>
+        <w:spacing w:before="0" w:after="60"/>
+        <w:ind w:left="283"/>
+      </w:pPr>
+      <w:r>
+        <w:rPr>
+          <w:sz w:val="22"/>
+        </w:rPr>
+        <w:t>A gold "★ majority" badge on any candidate who reached the majority threshold</w:t>
+      </w:r>
+    </w:p>
+    <w:p>
+      <w:pPr>
+        <w:pStyle w:val="ListBullet"/>
+        <w:spacing w:before="0" w:after="60"/>
+        <w:ind w:left="283"/>
+      </w:pPr>
+      <w:r>
+        <w:rPr>
+          <w:sz w:val="22"/>
+        </w:rPr>
+        <w:t>An orange "Awaiting transition" label indicating the election officer has not yet processed the round</w:t>
+      </w:r>
+    </w:p>
+    <w:p>
+      <w:pPr>
+        <w:spacing w:before="0" w:after="100"/>
+      </w:pPr>
+      <w:r>
+        <w:rPr>
+          <w:sz w:val="22"/>
+        </w:rPr>
+        <w:t>Once the election officer launches the next round or completes the office via the Round Transition screen, this card disappears and results move into the standard historical view below, labelled "Previous Rounds".</w:t>
+      </w:r>
+    </w:p>
+    <w:tbl>
+      <w:tblPr>
+        <w:tblStyle w:val="TableGrid"/>
+        <w:tblW w:type="auto" w:w="0"/>
+        <w:jc w:val="left"/>
+        <w:tblLook w:firstColumn="1" w:firstRow="1" w:lastColumn="0" w:lastRow="0" w:noHBand="0" w:noVBand="1" w:val="04A0"/>
+      </w:tblPr>
+      <w:tblGrid>
+        <w:gridCol w:w="9406"/>
+      </w:tblGrid>
+      <w:tr>
+        <w:tc>
+          <w:tcPr>
+            <w:tcW w:type="dxa" w:w="9406"/>
+            <w:shd w:val="clear" w:color="auto" w:fill="F0FAF0"/>
+            <w:tcBorders>
+              <w:top w:val="single" w:sz="12" w:space="0" w:color="2D6A4F"/>
+              <w:bottom w:val="single" w:sz="4" w:space="0" w:color="2D6A4F"/>
+              <w:left w:val="single" w:sz="12" w:space="0" w:color="2D6A4F"/>
+              <w:right w:val="single" w:sz="4" w:space="0" w:color="2D6A4F"/>
+            </w:tcBorders>
+          </w:tcPr>
+          <w:p>
+            <w:pPr>
+              <w:spacing w:before="40" w:after="40"/>
+            </w:pPr>
+            <w:r>
+              <w:rPr>
+                <w:b/>
+                <w:sz w:val="20"/>
+              </w:rPr>
+              <w:t xml:space="preserve">TIP:  </w:t>
+            </w:r>
+            <w:r>
+              <w:rPr>
+                <w:sz w:val="20"/>
+              </w:rPr>
+              <w:t>The chairman should monitor the dashboard during the round transition. The "Awaiting transition" card gives the chairman a full view of results to prepare their announcement before the election officer moves to the next round.</w:t>
+            </w:r>
+          </w:p>
+        </w:tc>
+      </w:tr>
+    </w:tbl>
+    <w:p>
+      <w:pPr>
+        <w:spacing w:after="80"/>
+      </w:pPr>
     </w:p>
     <w:p>
       <w:pPr>
@@ -13554,7 +13725,7 @@
           <w:color w:val="666666"/>
           <w:sz w:val="18"/>
         </w:rPr>
-        <w:t>Church Office Bearer Election System — User Manual  |  Version 1.1.0</w:t>
+        <w:t>Church Office Bearer Election System — User Manual  |  Version 1.1.1</w:t>
         <w:br/>
         <w:t>All data is stored on the local server. No votes leave the meeting network.</w:t>
       </w:r>

</xml_diff>

<commit_message>
Update manual to v1.1.5
Section 8 (Election Dashboard):
- Screenshot description updated to include the info strip
- New "Election Information" subsection documenting Expected Voters,
  Absentee Votes, and Total Eligible stat pills
- New "Before Round 1 starts" sub-section under Results documenting
  the pre-round nominee/config panel (v1.1.4)
- Active round results and awaiting transition behaviour already
  documented in v1.1.1 entry; now clarified with before-round state

Section 10 / 11 (Workflow & Walkthrough):
- Launch Next Round step updated: voting starts closed, officer must
  open voting after chairman announces the new round (v1.1.3)

Cover and footer bumped to Version 1.1.5.

Co-Authored-By: Claude Sonnet 4.6 <noreply@anthropic.com>
</commit_message>
<xml_diff>
--- a/manual.docx
+++ b/manual.docx
@@ -41,7 +41,7 @@
           <w:color w:val="666666"/>
           <w:sz w:val="22"/>
         </w:rPr>
-        <w:t>Version 1.1.1</w:t>
+        <w:t>Version 1.1.5</w:t>
       </w:r>
     </w:p>
     <w:p>
@@ -7622,7 +7622,7 @@
               </w:rPr>
               <w:t>[ Insert screenshot here ]</w:t>
               <w:br/>
-              <w:t>Navy header with "Election Dashboard" title, congregation name, and meeting date. Status section showing current office, round, voting status pill, votes per voter, and candidate name chips. Results section below for each office with vote bars, vote counts, and Elected/Not Elected badges.</w:t>
+              <w:t>Navy header with "Election Dashboard" title, congregation name, and meeting date. Status section showing current office, round, voting status pill, majority required, votes per voter, and candidate name chips. Election information strip with Expected Voters, Absentee Votes, and Total Eligible. Results section below for each office with vote bars, vote counts, and Elected/Not Elected badges.</w:t>
             </w:r>
           </w:p>
         </w:tc>
@@ -7643,7 +7643,7 @@
           <w:color w:val="1A2744"/>
           <w:sz w:val="26"/>
         </w:rPr>
-        <w:t>Status Section</w:t>
+        <w:t>Election Information</w:t>
       </w:r>
     </w:p>
     <w:p>
@@ -7654,7 +7654,7 @@
         <w:rPr>
           <w:sz w:val="22"/>
         </w:rPr>
-        <w:t>The status section shows the live state of the active office:</w:t>
+        <w:t>Below the status section, three stat pills display the voter numbers configured in Election Setup. These remain visible throughout the entire election:</w:t>
       </w:r>
     </w:p>
     <w:tbl>
@@ -7671,7 +7671,7 @@
       <w:tr>
         <w:tc>
           <w:tcPr>
-            <w:tcW w:type="dxa" w:w="2551"/>
+            <w:tcW w:type="dxa" w:w="2835"/>
             <w:shd w:val="clear" w:color="auto" w:fill="1A2744"/>
           </w:tcPr>
           <w:p>
@@ -7684,13 +7684,13 @@
                 <w:color w:val="FFFFFF"/>
                 <w:sz w:val="20"/>
               </w:rPr>
-              <w:t>Information</w:t>
-            </w:r>
-          </w:p>
-        </w:tc>
-        <w:tc>
-          <w:tcPr>
-            <w:tcW w:type="dxa" w:w="6520"/>
+              <w:t>Statistic</w:t>
+            </w:r>
+          </w:p>
+        </w:tc>
+        <w:tc>
+          <w:tcPr>
+            <w:tcW w:type="dxa" w:w="6236"/>
             <w:shd w:val="clear" w:color="auto" w:fill="1A2744"/>
           </w:tcPr>
           <w:p>
@@ -7711,7 +7711,7 @@
       <w:tr>
         <w:tc>
           <w:tcPr>
-            <w:tcW w:type="dxa" w:w="2551"/>
+            <w:tcW w:type="dxa" w:w="2835"/>
             <w:shd w:val="clear" w:color="auto" w:fill="FFFFFF"/>
           </w:tcPr>
           <w:p>
@@ -7722,13 +7722,13 @@
               <w:rPr>
                 <w:sz w:val="20"/>
               </w:rPr>
-              <w:t>Office &amp; Round</w:t>
-            </w:r>
-          </w:p>
-        </w:tc>
-        <w:tc>
-          <w:tcPr>
-            <w:tcW w:type="dxa" w:w="6520"/>
+              <w:t>Expected Voters (attending)</w:t>
+            </w:r>
+          </w:p>
+        </w:tc>
+        <w:tc>
+          <w:tcPr>
+            <w:tcW w:type="dxa" w:w="6236"/>
             <w:shd w:val="clear" w:color="auto" w:fill="FFFFFF"/>
           </w:tcPr>
           <w:p>
@@ -7739,7 +7739,7 @@
               <w:rPr>
                 <w:sz w:val="20"/>
               </w:rPr>
-              <w:t>Which office is being voted on and the current round number</w:t>
+              <w:t>The number of eligible voters expected to attend the meeting in person, as entered in Election Setup → Details.</w:t>
             </w:r>
           </w:p>
         </w:tc>
@@ -7747,7 +7747,7 @@
       <w:tr>
         <w:tc>
           <w:tcPr>
-            <w:tcW w:type="dxa" w:w="2551"/>
+            <w:tcW w:type="dxa" w:w="2835"/>
             <w:shd w:val="clear" w:color="auto" w:fill="F8F6F1"/>
           </w:tcPr>
           <w:p>
@@ -7758,13 +7758,13 @@
               <w:rPr>
                 <w:sz w:val="20"/>
               </w:rPr>
-              <w:t>Status Pill</w:t>
-            </w:r>
-          </w:p>
-        </w:tc>
-        <w:tc>
-          <w:tcPr>
-            <w:tcW w:type="dxa" w:w="6520"/>
+              <w:t>Absentee Votes</w:t>
+            </w:r>
+          </w:p>
+        </w:tc>
+        <w:tc>
+          <w:tcPr>
+            <w:tcW w:type="dxa" w:w="6236"/>
             <w:shd w:val="clear" w:color="auto" w:fill="F8F6F1"/>
           </w:tcPr>
           <w:p>
@@ -7775,7 +7775,7 @@
               <w:rPr>
                 <w:sz w:val="20"/>
               </w:rPr>
-              <w:t>Voting Open (green) / Voting Closed (orange) / Configuring (blue)</w:t>
+              <w:t>The number of absentee ballots received before the meeting, as entered in Election Setup → Details. Counted in Round 1 only.</w:t>
             </w:r>
           </w:p>
         </w:tc>
@@ -7783,7 +7783,7 @@
       <w:tr>
         <w:tc>
           <w:tcPr>
-            <w:tcW w:type="dxa" w:w="2551"/>
+            <w:tcW w:type="dxa" w:w="2835"/>
             <w:shd w:val="clear" w:color="auto" w:fill="FFFFFF"/>
           </w:tcPr>
           <w:p>
@@ -7794,13 +7794,13 @@
               <w:rPr>
                 <w:sz w:val="20"/>
               </w:rPr>
-              <w:t>Majority Required</w:t>
-            </w:r>
-          </w:p>
-        </w:tc>
-        <w:tc>
-          <w:tcPr>
-            <w:tcW w:type="dxa" w:w="6520"/>
+              <w:t>Total Eligible</w:t>
+            </w:r>
+          </w:p>
+        </w:tc>
+        <w:tc>
+          <w:tcPr>
+            <w:tcW w:type="dxa" w:w="6236"/>
             <w:shd w:val="clear" w:color="auto" w:fill="FFFFFF"/>
           </w:tcPr>
           <w:p>
@@ -7811,79 +7811,7 @@
               <w:rPr>
                 <w:sz w:val="20"/>
               </w:rPr>
-              <w:t>Pill showing the minimum votes needed for election in the current round. Round 1 uses attending + absentee voters; Round 2+ uses attending voters only.</w:t>
-            </w:r>
-          </w:p>
-        </w:tc>
-      </w:tr>
-      <w:tr>
-        <w:tc>
-          <w:tcPr>
-            <w:tcW w:type="dxa" w:w="2551"/>
-            <w:shd w:val="clear" w:color="auto" w:fill="F8F6F1"/>
-          </w:tcPr>
-          <w:p>
-            <w:pPr>
-              <w:spacing w:before="40" w:after="40"/>
-            </w:pPr>
-            <w:r>
-              <w:rPr>
-                <w:sz w:val="20"/>
-              </w:rPr>
-              <w:t>Votes per Voter</w:t>
-            </w:r>
-          </w:p>
-        </w:tc>
-        <w:tc>
-          <w:tcPr>
-            <w:tcW w:type="dxa" w:w="6520"/>
-            <w:shd w:val="clear" w:color="auto" w:fill="F8F6F1"/>
-          </w:tcPr>
-          <w:p>
-            <w:pPr>
-              <w:spacing w:before="40" w:after="40"/>
-            </w:pPr>
-            <w:r>
-              <w:rPr>
-                <w:sz w:val="20"/>
-              </w:rPr>
-              <w:t>How many candidates each voter may select in the current round</w:t>
-            </w:r>
-          </w:p>
-        </w:tc>
-      </w:tr>
-      <w:tr>
-        <w:tc>
-          <w:tcPr>
-            <w:tcW w:type="dxa" w:w="2551"/>
-            <w:shd w:val="clear" w:color="auto" w:fill="FFFFFF"/>
-          </w:tcPr>
-          <w:p>
-            <w:pPr>
-              <w:spacing w:before="40" w:after="40"/>
-            </w:pPr>
-            <w:r>
-              <w:rPr>
-                <w:sz w:val="20"/>
-              </w:rPr>
-              <w:t>Candidates This Round</w:t>
-            </w:r>
-          </w:p>
-        </w:tc>
-        <w:tc>
-          <w:tcPr>
-            <w:tcW w:type="dxa" w:w="6520"/>
-            <w:shd w:val="clear" w:color="auto" w:fill="FFFFFF"/>
-          </w:tcPr>
-          <w:p>
-            <w:pPr>
-              <w:spacing w:before="40" w:after="40"/>
-            </w:pPr>
-            <w:r>
-              <w:rPr>
-                <w:sz w:val="20"/>
-              </w:rPr>
-              <w:t>Names of all candidates on the current ballot shown as chips</w:t>
+              <w:t>Expected Voters + Absentee Votes. Represents the full electorate for Round 1.</w:t>
             </w:r>
           </w:p>
         </w:tc>
@@ -7904,7 +7832,7 @@
           <w:color w:val="1A2744"/>
           <w:sz w:val="26"/>
         </w:rPr>
-        <w:t>Results Section</w:t>
+        <w:t>Status Section</w:t>
       </w:r>
     </w:p>
     <w:p>
@@ -7915,506 +7843,7 @@
         <w:rPr>
           <w:sz w:val="22"/>
         </w:rPr>
-        <w:t>For each configured office the results section shows all candidates. The content adapts to the current state of the election:</w:t>
-      </w:r>
-    </w:p>
-    <w:p>
-      <w:pPr>
-        <w:spacing w:before="160" w:after="60"/>
-      </w:pPr>
-      <w:r>
-        <w:rPr>
-          <w:b/>
-          <w:color w:val="666666"/>
-          <w:sz w:val="20"/>
-        </w:rPr>
-        <w:t>DURING AN ACTIVE ROUND (VOTING OPEN OR CLOSED)</w:t>
-      </w:r>
-    </w:p>
-    <w:p>
-      <w:pPr>
-        <w:pStyle w:val="ListBullet"/>
-        <w:spacing w:before="0" w:after="60"/>
-        <w:ind w:left="283"/>
-      </w:pPr>
-      <w:r>
-        <w:rPr>
-          <w:sz w:val="22"/>
-        </w:rPr>
-        <w:t>All candidates listed with vote counts and proportional bars</w:t>
-      </w:r>
-    </w:p>
-    <w:p>
-      <w:pPr>
-        <w:pStyle w:val="ListBullet"/>
-        <w:spacing w:before="0" w:after="60"/>
-        <w:ind w:left="283"/>
-      </w:pPr>
-      <w:r>
-        <w:rPr>
-          <w:sz w:val="22"/>
-        </w:rPr>
-        <w:t>"✓ Elected · Rd X" badge on previously elected candidates</w:t>
-      </w:r>
-    </w:p>
-    <w:p>
-      <w:pPr>
-        <w:pStyle w:val="ListBullet"/>
-        <w:spacing w:before="0" w:after="60"/>
-        <w:ind w:left="283"/>
-      </w:pPr>
-      <w:r>
-        <w:rPr>
-          <w:sz w:val="22"/>
-        </w:rPr>
-        <w:t>"Not elected" label on candidates who did not receive enough votes in a completed round</w:t>
-      </w:r>
-    </w:p>
-    <w:p>
-      <w:pPr>
-        <w:spacing w:before="160" w:after="60"/>
-      </w:pPr>
-      <w:r>
-        <w:rPr>
-          <w:b/>
-          <w:color w:val="666666"/>
-          <w:sz w:val="20"/>
-        </w:rPr>
-        <w:t>IMMEDIATELY AFTER ENDING A ROUND (AWAITING TRANSITION)</w:t>
-      </w:r>
-    </w:p>
-    <w:p>
-      <w:pPr>
-        <w:spacing w:before="0" w:after="100"/>
-      </w:pPr>
-      <w:r>
-        <w:rPr>
-          <w:sz w:val="22"/>
-        </w:rPr>
-        <w:t>As soon as the election officer clicks End Round, a green "Round N Results — Awaiting transition" card appears at the top of the office section before the election officer has processed the Round Transition screen. This card shows:</w:t>
-      </w:r>
-    </w:p>
-    <w:p>
-      <w:pPr>
-        <w:pStyle w:val="ListBullet"/>
-        <w:spacing w:before="0" w:after="60"/>
-        <w:ind w:left="283"/>
-      </w:pPr>
-      <w:r>
-        <w:rPr>
-          <w:sz w:val="22"/>
-        </w:rPr>
-        <w:t>All candidates ranked by votes received in that round, with full vote counts and proportional bars</w:t>
-      </w:r>
-    </w:p>
-    <w:p>
-      <w:pPr>
-        <w:pStyle w:val="ListBullet"/>
-        <w:spacing w:before="0" w:after="60"/>
-        <w:ind w:left="283"/>
-      </w:pPr>
-      <w:r>
-        <w:rPr>
-          <w:sz w:val="22"/>
-        </w:rPr>
-        <w:t>Total ballot count and majority required for that round</w:t>
-      </w:r>
-    </w:p>
-    <w:p>
-      <w:pPr>
-        <w:pStyle w:val="ListBullet"/>
-        <w:spacing w:before="0" w:after="60"/>
-        <w:ind w:left="283"/>
-      </w:pPr>
-      <w:r>
-        <w:rPr>
-          <w:sz w:val="22"/>
-        </w:rPr>
-        <w:t>A gold "★ majority" badge on any candidate who reached the majority threshold</w:t>
-      </w:r>
-    </w:p>
-    <w:p>
-      <w:pPr>
-        <w:pStyle w:val="ListBullet"/>
-        <w:spacing w:before="0" w:after="60"/>
-        <w:ind w:left="283"/>
-      </w:pPr>
-      <w:r>
-        <w:rPr>
-          <w:sz w:val="22"/>
-        </w:rPr>
-        <w:t>An orange "Awaiting transition" label indicating the election officer has not yet processed the round</w:t>
-      </w:r>
-    </w:p>
-    <w:p>
-      <w:pPr>
-        <w:spacing w:before="0" w:after="100"/>
-      </w:pPr>
-      <w:r>
-        <w:rPr>
-          <w:sz w:val="22"/>
-        </w:rPr>
-        <w:t>Once the election officer launches the next round or completes the office via the Round Transition screen, this card disappears and results move into the standard historical view below, labelled "Previous Rounds".</w:t>
-      </w:r>
-    </w:p>
-    <w:tbl>
-      <w:tblPr>
-        <w:tblStyle w:val="TableGrid"/>
-        <w:tblW w:type="auto" w:w="0"/>
-        <w:jc w:val="left"/>
-        <w:tblLook w:firstColumn="1" w:firstRow="1" w:lastColumn="0" w:lastRow="0" w:noHBand="0" w:noVBand="1" w:val="04A0"/>
-      </w:tblPr>
-      <w:tblGrid>
-        <w:gridCol w:w="9406"/>
-      </w:tblGrid>
-      <w:tr>
-        <w:tc>
-          <w:tcPr>
-            <w:tcW w:type="dxa" w:w="9406"/>
-            <w:shd w:val="clear" w:color="auto" w:fill="F0FAF0"/>
-            <w:tcBorders>
-              <w:top w:val="single" w:sz="12" w:space="0" w:color="2D6A4F"/>
-              <w:bottom w:val="single" w:sz="4" w:space="0" w:color="2D6A4F"/>
-              <w:left w:val="single" w:sz="12" w:space="0" w:color="2D6A4F"/>
-              <w:right w:val="single" w:sz="4" w:space="0" w:color="2D6A4F"/>
-            </w:tcBorders>
-          </w:tcPr>
-          <w:p>
-            <w:pPr>
-              <w:spacing w:before="40" w:after="40"/>
-            </w:pPr>
-            <w:r>
-              <w:rPr>
-                <w:b/>
-                <w:sz w:val="20"/>
-              </w:rPr>
-              <w:t xml:space="preserve">TIP:  </w:t>
-            </w:r>
-            <w:r>
-              <w:rPr>
-                <w:sz w:val="20"/>
-              </w:rPr>
-              <w:t>The chairman should monitor the dashboard during the round transition. The "Awaiting transition" card gives the chairman a full view of results to prepare their announcement before the election officer moves to the next round.</w:t>
-            </w:r>
-          </w:p>
-        </w:tc>
-      </w:tr>
-    </w:tbl>
-    <w:p>
-      <w:pPr>
-        <w:spacing w:after="80"/>
-      </w:pPr>
-    </w:p>
-    <w:p>
-      <w:pPr>
-        <w:spacing w:before="240" w:after="80"/>
-      </w:pPr>
-      <w:r>
-        <w:rPr>
-          <w:b/>
-          <w:color w:val="1A2744"/>
-          <w:sz w:val="26"/>
-        </w:rPr>
-        <w:t>Delete All Election Data</w:t>
-      </w:r>
-    </w:p>
-    <w:p>
-      <w:pPr>
-        <w:spacing w:before="0" w:after="100"/>
-      </w:pPr>
-      <w:r>
-        <w:rPr>
-          <w:sz w:val="22"/>
-        </w:rPr>
-        <w:t>When both offices are complete, a red "Delete All Election Data" button appears at the bottom of the dashboard. This clears all election data and resets the system for the next election. Two confirmation prompts prevent accidental deletion.</w:t>
-      </w:r>
-    </w:p>
-    <w:tbl>
-      <w:tblPr>
-        <w:tblStyle w:val="TableGrid"/>
-        <w:tblW w:type="auto" w:w="0"/>
-        <w:jc w:val="left"/>
-        <w:tblLook w:firstColumn="1" w:firstRow="1" w:lastColumn="0" w:lastRow="0" w:noHBand="0" w:noVBand="1" w:val="04A0"/>
-      </w:tblPr>
-      <w:tblGrid>
-        <w:gridCol w:w="9406"/>
-      </w:tblGrid>
-      <w:tr>
-        <w:tc>
-          <w:tcPr>
-            <w:tcW w:type="dxa" w:w="9406"/>
-            <w:shd w:val="clear" w:color="auto" w:fill="FFF4E0"/>
-            <w:tcBorders>
-              <w:top w:val="single" w:sz="12" w:space="0" w:color="B8942A"/>
-              <w:bottom w:val="single" w:sz="4" w:space="0" w:color="B8942A"/>
-              <w:left w:val="single" w:sz="12" w:space="0" w:color="B8942A"/>
-              <w:right w:val="single" w:sz="4" w:space="0" w:color="B8942A"/>
-            </w:tcBorders>
-          </w:tcPr>
-          <w:p>
-            <w:pPr>
-              <w:spacing w:before="40" w:after="40"/>
-            </w:pPr>
-            <w:r>
-              <w:rPr>
-                <w:b/>
-                <w:sz w:val="20"/>
-              </w:rPr>
-              <w:t xml:space="preserve">IMPORTANT:  </w:t>
-            </w:r>
-            <w:r>
-              <w:rPr>
-                <w:sz w:val="20"/>
-              </w:rPr>
-              <w:t>The Dashboard shows actual vote counts. Only the chairman should have the results password. Do not leave the dashboard visible on an unattended or shared screen.</w:t>
-            </w:r>
-          </w:p>
-        </w:tc>
-      </w:tr>
-    </w:tbl>
-    <w:p>
-      <w:pPr>
-        <w:spacing w:after="80"/>
-      </w:pPr>
-    </w:p>
-    <w:p>
-      <w:pPr>
-        <w:pageBreakBefore/>
-        <w:spacing w:before="360" w:after="120"/>
-        <w:pBdr>
-          <w:bottom w:val="single" w:sz="8" w:space="4" w:color="1a2744"/>
-        </w:pBdr>
-      </w:pPr>
-      <w:r>
-        <w:rPr>
-          <w:b/>
-          <w:color w:val="1A2744"/>
-          <w:sz w:val="36"/>
-        </w:rPr>
-        <w:t>9.  Election Complete Screen</w:t>
-      </w:r>
-    </w:p>
-    <w:p>
-      <w:pPr>
-        <w:spacing w:before="0" w:after="100"/>
-      </w:pPr>
-      <w:r>
-        <w:rPr>
-          <w:sz w:val="22"/>
-        </w:rPr>
-        <w:t>After the election officer clicks "Complete This Office" for the last configured office, the system shows the Election Complete screen. This screen is intended for the election officer and shows which candidates were elected — without vote counts.</w:t>
-      </w:r>
-    </w:p>
-    <w:p>
-      <w:pPr>
-        <w:spacing w:before="0" w:after="100"/>
-      </w:pPr>
-      <w:r>
-        <w:rPr>
-          <w:sz w:val="22"/>
-        </w:rPr>
-        <w:t>The screen displays:</w:t>
-      </w:r>
-    </w:p>
-    <w:p>
-      <w:pPr>
-        <w:pStyle w:val="ListBullet"/>
-        <w:spacing w:before="0" w:after="60"/>
-        <w:ind w:left="283"/>
-      </w:pPr>
-      <w:r>
-        <w:rPr>
-          <w:sz w:val="22"/>
-        </w:rPr>
-        <w:t>A navy header: "Election Complete" with the meeting date</w:t>
-      </w:r>
-    </w:p>
-    <w:p>
-      <w:pPr>
-        <w:pStyle w:val="ListBullet"/>
-        <w:spacing w:before="0" w:after="60"/>
-        <w:ind w:left="283"/>
-      </w:pPr>
-      <w:r>
-        <w:rPr>
-          <w:sz w:val="22"/>
-        </w:rPr>
-        <w:t>A card for each configured office listing the elected candidates by name only</w:t>
-      </w:r>
-    </w:p>
-    <w:p>
-      <w:pPr>
-        <w:pStyle w:val="ListBullet"/>
-        <w:spacing w:before="0" w:after="60"/>
-        <w:ind w:left="283"/>
-      </w:pPr>
-      <w:r>
-        <w:rPr>
-          <w:sz w:val="22"/>
-        </w:rPr>
-        <w:t>A "Back to Home" button to return to the landing page</w:t>
-      </w:r>
-    </w:p>
-    <w:tbl>
-      <w:tblPr>
-        <w:tblStyle w:val="TableGrid"/>
-        <w:tblW w:type="auto" w:w="0"/>
-        <w:jc w:val="left"/>
-        <w:tblLook w:firstColumn="1" w:firstRow="1" w:lastColumn="0" w:lastRow="0" w:noHBand="0" w:noVBand="1" w:val="04A0"/>
-      </w:tblPr>
-      <w:tblGrid>
-        <w:gridCol w:w="9406"/>
-      </w:tblGrid>
-      <w:tr>
-        <w:tc>
-          <w:tcPr>
-            <w:tcW w:type="dxa" w:w="9406"/>
-            <w:shd w:val="clear" w:color="auto" w:fill="E8F0FA"/>
-            <w:tcBorders>
-              <w:top w:val="single" w:sz="12" w:space="0" w:color="1A3A5C"/>
-              <w:bottom w:val="single" w:sz="4" w:space="0" w:color="1A3A5C"/>
-              <w:left w:val="single" w:sz="12" w:space="0" w:color="1A3A5C"/>
-              <w:right w:val="single" w:sz="4" w:space="0" w:color="1A3A5C"/>
-            </w:tcBorders>
-          </w:tcPr>
-          <w:p>
-            <w:pPr>
-              <w:spacing w:before="40" w:after="40"/>
-            </w:pPr>
-            <w:r>
-              <w:rPr>
-                <w:b/>
-                <w:sz w:val="20"/>
-              </w:rPr>
-              <w:t xml:space="preserve">NOTE:  </w:t>
-            </w:r>
-            <w:r>
-              <w:rPr>
-                <w:sz w:val="20"/>
-              </w:rPr>
-              <w:t>Vote counts are intentionally not shown on this screen. The election officer may communicate elected names to the chairman verbally. The chairman then announces results to the congregation and may view vote counts on the Election Dashboard.</w:t>
-            </w:r>
-          </w:p>
-        </w:tc>
-      </w:tr>
-    </w:tbl>
-    <w:p>
-      <w:pPr>
-        <w:spacing w:after="80"/>
-      </w:pPr>
-    </w:p>
-    <w:tbl>
-      <w:tblPr>
-        <w:tblStyle w:val="TableGrid"/>
-        <w:tblW w:type="auto" w:w="0"/>
-        <w:jc w:val="left"/>
-        <w:tblLook w:firstColumn="1" w:firstRow="1" w:lastColumn="0" w:lastRow="0" w:noHBand="0" w:noVBand="1" w:val="04A0"/>
-      </w:tblPr>
-      <w:tblGrid>
-        <w:gridCol w:w="9406"/>
-      </w:tblGrid>
-      <w:tr>
-        <w:tc>
-          <w:tcPr>
-            <w:tcW w:type="dxa" w:w="9406"/>
-            <w:shd w:val="clear" w:color="auto" w:fill="B8942A"/>
-            <w:tcBorders>
-              <w:top w:val="single" w:sz="4" w:space="0" w:color="B8942A"/>
-              <w:bottom w:val="single" w:sz="4" w:space="0" w:color="B8942A"/>
-              <w:left w:val="single" w:sz="4" w:space="0" w:color="B8942A"/>
-              <w:right w:val="single" w:sz="4" w:space="0" w:color="B8942A"/>
-            </w:tcBorders>
-          </w:tcPr>
-          <w:p>
-            <w:pPr>
-              <w:spacing w:before="40" w:after="40"/>
-            </w:pPr>
-            <w:r>
-              <w:rPr>
-                <w:b/>
-                <w:color w:val="FFFFFF"/>
-                <w:sz w:val="18"/>
-              </w:rPr>
-              <w:t xml:space="preserve">  SCREENSHOT — ELECTION COMPLETE SCREEN</w:t>
-            </w:r>
-          </w:p>
-        </w:tc>
-      </w:tr>
-      <w:tr>
-        <w:tc>
-          <w:tcPr>
-            <w:tcW w:type="dxa" w:w="9406"/>
-            <w:shd w:val="clear" w:color="auto" w:fill="FFFBF0"/>
-            <w:tcBorders>
-              <w:top w:val="single" w:sz="4" w:space="0" w:color="B8942A"/>
-              <w:bottom w:val="single" w:sz="4" w:space="0" w:color="B8942A"/>
-              <w:left w:val="single" w:sz="4" w:space="0" w:color="B8942A"/>
-              <w:right w:val="single" w:sz="4" w:space="0" w:color="B8942A"/>
-            </w:tcBorders>
-          </w:tcPr>
-          <w:p>
-            <w:pPr>
-              <w:spacing w:before="120" w:after="320"/>
-              <w:jc w:val="center"/>
-            </w:pPr>
-            <w:r>
-              <w:rPr>
-                <w:i/>
-                <w:color w:val="7C5A00"/>
-                <w:sz w:val="18"/>
-              </w:rPr>
-              <w:t>[ Insert screenshot here ]</w:t>
-              <w:br/>
-              <w:t>Navy header "Election Complete" with meeting date. "Office of Elder" card listing elected names with coloured dot indicators. "Office of Deacon" card below. "Back to Home" button at the bottom.</w:t>
-            </w:r>
-          </w:p>
-        </w:tc>
-      </w:tr>
-    </w:tbl>
-    <w:p>
-      <w:pPr>
-        <w:spacing w:after="120"/>
-      </w:pPr>
-    </w:p>
-    <w:p>
-      <w:pPr>
-        <w:spacing w:before="0" w:after="100"/>
-      </w:pPr>
-      <w:r>
-        <w:rPr>
-          <w:sz w:val="22"/>
-        </w:rPr>
-        <w:t>Simultaneously, all voters' screens automatically update to show a plain thank-you message: "Thank you for participating in the [Church Name] office bearer election. The election has been completed. The chairman will announce the results."</w:t>
-      </w:r>
-    </w:p>
-    <w:p>
-      <w:pPr>
-        <w:pageBreakBefore/>
-        <w:spacing w:before="360" w:after="120"/>
-        <w:pBdr>
-          <w:bottom w:val="single" w:sz="8" w:space="4" w:color="1a2744"/>
-        </w:pBdr>
-      </w:pPr>
-      <w:r>
-        <w:rPr>
-          <w:b/>
-          <w:color w:val="1A2744"/>
-          <w:sz w:val="36"/>
-        </w:rPr>
-        <w:t>10.  Best Practices &amp; Suggested Workflow</w:t>
-      </w:r>
-    </w:p>
-    <w:p>
-      <w:pPr>
-        <w:spacing w:before="240" w:after="80"/>
-      </w:pPr>
-      <w:r>
-        <w:rPr>
-          <w:b/>
-          <w:color w:val="1A2744"/>
-          <w:sz w:val="26"/>
-        </w:rPr>
-        <w:t>Roles &amp; Responsibilities</w:t>
+        <w:t>The status section shows the live state of the active office:</w:t>
       </w:r>
     </w:p>
     <w:tbl>
@@ -8444,7 +7873,7 @@
                 <w:color w:val="FFFFFF"/>
                 <w:sz w:val="20"/>
               </w:rPr>
-              <w:t>Role</w:t>
+              <w:t>Information</w:t>
             </w:r>
           </w:p>
         </w:tc>
@@ -8463,7 +7892,7 @@
                 <w:color w:val="FFFFFF"/>
                 <w:sz w:val="20"/>
               </w:rPr>
-              <w:t>Responsibilities During Election</w:t>
+              <w:t>Description</w:t>
             </w:r>
           </w:p>
         </w:tc>
@@ -8482,7 +7911,7 @@
               <w:rPr>
                 <w:sz w:val="20"/>
               </w:rPr>
-              <w:t>Election Officer</w:t>
+              <w:t>Office &amp; Round</w:t>
             </w:r>
           </w:p>
         </w:tc>
@@ -8499,7 +7928,7 @@
               <w:rPr>
                 <w:sz w:val="20"/>
               </w:rPr>
-              <w:t>Operates Round Control; opens/closes voting; processes round transitions; does not share admin password</w:t>
+              <w:t>Which office is being voted on and the current round number</w:t>
             </w:r>
           </w:p>
         </w:tc>
@@ -8518,7 +7947,7 @@
               <w:rPr>
                 <w:sz w:val="20"/>
               </w:rPr>
-              <w:t>Chairman</w:t>
+              <w:t>Status Pill</w:t>
             </w:r>
           </w:p>
         </w:tc>
@@ -8535,7 +7964,7 @@
               <w:rPr>
                 <w:sz w:val="20"/>
               </w:rPr>
-              <w:t>Announces candidates and voting instructions; accesses Election Dashboard; announces results verbally</w:t>
+              <w:t>Voting Open (green) / Voting Closed (orange) / Configuring (blue)</w:t>
             </w:r>
           </w:p>
         </w:tc>
@@ -8554,7 +7983,7 @@
               <w:rPr>
                 <w:sz w:val="20"/>
               </w:rPr>
-              <w:t>Paper Ballot Volunteer</w:t>
+              <w:t>Majority Required</w:t>
             </w:r>
           </w:p>
         </w:tc>
@@ -8571,7 +8000,7 @@
               <w:rPr>
                 <w:sz w:val="20"/>
               </w:rPr>
-              <w:t>Operates Paper Ballot Entry station; collects paper ballots from members; enters them during the voting period</w:t>
+              <w:t>Pill showing the minimum votes needed for election in the current round. Round 1 uses attending + absentee voters; Round 2+ uses attending voters only.</w:t>
             </w:r>
           </w:p>
         </w:tc>
@@ -8590,7 +8019,7 @@
               <w:rPr>
                 <w:sz w:val="20"/>
               </w:rPr>
-              <w:t>Door Steward</w:t>
+              <w:t>Votes per Voter</w:t>
             </w:r>
           </w:p>
         </w:tc>
@@ -8607,7 +8036,43 @@
               <w:rPr>
                 <w:sz w:val="20"/>
               </w:rPr>
-              <w:t>Distributes token cards to verified eligible voters as they enter</w:t>
+              <w:t>How many candidates each voter may select in the current round</w:t>
+            </w:r>
+          </w:p>
+        </w:tc>
+      </w:tr>
+      <w:tr>
+        <w:tc>
+          <w:tcPr>
+            <w:tcW w:type="dxa" w:w="2551"/>
+            <w:shd w:val="clear" w:color="auto" w:fill="FFFFFF"/>
+          </w:tcPr>
+          <w:p>
+            <w:pPr>
+              <w:spacing w:before="40" w:after="40"/>
+            </w:pPr>
+            <w:r>
+              <w:rPr>
+                <w:sz w:val="20"/>
+              </w:rPr>
+              <w:t>Candidates This Round</w:t>
+            </w:r>
+          </w:p>
+        </w:tc>
+        <w:tc>
+          <w:tcPr>
+            <w:tcW w:type="dxa" w:w="6520"/>
+            <w:shd w:val="clear" w:color="auto" w:fill="FFFFFF"/>
+          </w:tcPr>
+          <w:p>
+            <w:pPr>
+              <w:spacing w:before="40" w:after="40"/>
+            </w:pPr>
+            <w:r>
+              <w:rPr>
+                <w:sz w:val="20"/>
+              </w:rPr>
+              <w:t>Names of all candidates on the current ballot shown as chips</w:t>
             </w:r>
           </w:p>
         </w:tc>
@@ -8628,7 +8093,42 @@
           <w:color w:val="1A2744"/>
           <w:sz w:val="26"/>
         </w:rPr>
-        <w:t>Preparation — At Least 1 Week Before the Meeting</w:t>
+        <w:t>Results Section</w:t>
+      </w:r>
+    </w:p>
+    <w:p>
+      <w:pPr>
+        <w:spacing w:before="0" w:after="100"/>
+      </w:pPr>
+      <w:r>
+        <w:rPr>
+          <w:sz w:val="22"/>
+        </w:rPr>
+        <w:t>For each configured office the results section shows all candidates. The content adapts to the current state of the election:</w:t>
+      </w:r>
+    </w:p>
+    <w:p>
+      <w:pPr>
+        <w:spacing w:before="160" w:after="60"/>
+      </w:pPr>
+      <w:r>
+        <w:rPr>
+          <w:b/>
+          <w:color w:val="666666"/>
+          <w:sz w:val="20"/>
+        </w:rPr>
+        <w:t>BEFORE ROUND 1 STARTS</w:t>
+      </w:r>
+    </w:p>
+    <w:p>
+      <w:pPr>
+        <w:spacing w:before="0" w:after="100"/>
+      </w:pPr>
+      <w:r>
+        <w:rPr>
+          <w:sz w:val="22"/>
+        </w:rPr>
+        <w:t>When an office is configured but the election officer has not yet started Round 1, the dashboard shows a pre-round information panel for that office containing:</w:t>
       </w:r>
     </w:p>
     <w:p>
@@ -8641,7 +8141,7 @@
         <w:rPr>
           <w:sz w:val="22"/>
         </w:rPr>
-        <w:t>Confirm the list of nominees for each office with the consistory.</w:t>
+        <w:t>A "Round 1 — Not Yet Started" label with a blue "⚙ Configuring" tag and the Round 1 majority required</w:t>
       </w:r>
     </w:p>
     <w:p>
@@ -8654,7 +8154,7 @@
         <w:rPr>
           <w:sz w:val="22"/>
         </w:rPr>
-        <w:t>Confirm the number of eligible voters (communicant male members).</w:t>
+        <w:t>All nominees listed as chips</w:t>
       </w:r>
     </w:p>
     <w:p>
@@ -8667,7 +8167,20 @@
         <w:rPr>
           <w:sz w:val="22"/>
         </w:rPr>
-        <w:t>Test the system end-to-end using a laptop and two phones.</w:t>
+        <w:t>Positions to fill and votes per voter for Round 1</w:t>
+      </w:r>
+    </w:p>
+    <w:p>
+      <w:pPr>
+        <w:spacing w:before="160" w:after="60"/>
+      </w:pPr>
+      <w:r>
+        <w:rPr>
+          <w:b/>
+          <w:color w:val="666666"/>
+          <w:sz w:val="20"/>
+        </w:rPr>
+        <w:t>DURING AN ACTIVE ROUND (VOTING OPEN OR CLOSED)</w:t>
       </w:r>
     </w:p>
     <w:p>
@@ -8680,7 +8193,7 @@
         <w:rPr>
           <w:sz w:val="22"/>
         </w:rPr>
-        <w:t>Change both passwords from the defaults in Election Setup → Settings.</w:t>
+        <w:t>All candidates listed with vote counts and proportional bars</w:t>
       </w:r>
     </w:p>
     <w:p>
@@ -8693,7 +8206,7 @@
         <w:rPr>
           <w:sz w:val="22"/>
         </w:rPr>
-        <w:t>Record both passwords securely — there is no password recovery option.</w:t>
+        <w:t>"✓ Elected · Rd X" badge on previously elected candidates</w:t>
       </w:r>
     </w:p>
     <w:p>
@@ -8706,7 +8219,31 @@
         <w:rPr>
           <w:sz w:val="22"/>
         </w:rPr>
-        <w:t>Print token cards and cut them. Store securely.</w:t>
+        <w:t>"Not elected" label on candidates who did not receive enough votes in a completed round</w:t>
+      </w:r>
+    </w:p>
+    <w:p>
+      <w:pPr>
+        <w:spacing w:before="160" w:after="60"/>
+      </w:pPr>
+      <w:r>
+        <w:rPr>
+          <w:b/>
+          <w:color w:val="666666"/>
+          <w:sz w:val="20"/>
+        </w:rPr>
+        <w:t>IMMEDIATELY AFTER ENDING A ROUND (AWAITING TRANSITION)</w:t>
+      </w:r>
+    </w:p>
+    <w:p>
+      <w:pPr>
+        <w:spacing w:before="0" w:after="100"/>
+      </w:pPr>
+      <w:r>
+        <w:rPr>
+          <w:sz w:val="22"/>
+        </w:rPr>
+        <w:t>As soon as the election officer clicks End Round, a green "Round N Results — Awaiting transition" card appears at the top of the office section before the election officer has processed the Round Transition screen. This card shows:</w:t>
       </w:r>
     </w:p>
     <w:p>
@@ -8719,8 +8256,106 @@
         <w:rPr>
           <w:sz w:val="22"/>
         </w:rPr>
-        <w:t>Print paper ballots for each office (recommend 15–20% of expected voter count).</w:t>
-      </w:r>
+        <w:t>All candidates ranked by votes received in that round, with full vote counts and proportional bars</w:t>
+      </w:r>
+    </w:p>
+    <w:p>
+      <w:pPr>
+        <w:pStyle w:val="ListBullet"/>
+        <w:spacing w:before="0" w:after="60"/>
+        <w:ind w:left="283"/>
+      </w:pPr>
+      <w:r>
+        <w:rPr>
+          <w:sz w:val="22"/>
+        </w:rPr>
+        <w:t>Total ballot count and majority required for that round</w:t>
+      </w:r>
+    </w:p>
+    <w:p>
+      <w:pPr>
+        <w:pStyle w:val="ListBullet"/>
+        <w:spacing w:before="0" w:after="60"/>
+        <w:ind w:left="283"/>
+      </w:pPr>
+      <w:r>
+        <w:rPr>
+          <w:sz w:val="22"/>
+        </w:rPr>
+        <w:t>A gold "★ majority" badge on any candidate who reached the majority threshold</w:t>
+      </w:r>
+    </w:p>
+    <w:p>
+      <w:pPr>
+        <w:pStyle w:val="ListBullet"/>
+        <w:spacing w:before="0" w:after="60"/>
+        <w:ind w:left="283"/>
+      </w:pPr>
+      <w:r>
+        <w:rPr>
+          <w:sz w:val="22"/>
+        </w:rPr>
+        <w:t>An orange "Awaiting transition" label indicating the election officer has not yet processed the round</w:t>
+      </w:r>
+    </w:p>
+    <w:p>
+      <w:pPr>
+        <w:spacing w:before="0" w:after="100"/>
+      </w:pPr>
+      <w:r>
+        <w:rPr>
+          <w:sz w:val="22"/>
+        </w:rPr>
+        <w:t>Once the election officer launches the next round or completes the office via the Round Transition screen, this card disappears and results move into the standard historical view below, labelled "Previous Rounds".</w:t>
+      </w:r>
+    </w:p>
+    <w:tbl>
+      <w:tblPr>
+        <w:tblStyle w:val="TableGrid"/>
+        <w:tblW w:type="auto" w:w="0"/>
+        <w:jc w:val="left"/>
+        <w:tblLook w:firstColumn="1" w:firstRow="1" w:lastColumn="0" w:lastRow="0" w:noHBand="0" w:noVBand="1" w:val="04A0"/>
+      </w:tblPr>
+      <w:tblGrid>
+        <w:gridCol w:w="9406"/>
+      </w:tblGrid>
+      <w:tr>
+        <w:tc>
+          <w:tcPr>
+            <w:tcW w:type="dxa" w:w="9406"/>
+            <w:shd w:val="clear" w:color="auto" w:fill="F0FAF0"/>
+            <w:tcBorders>
+              <w:top w:val="single" w:sz="12" w:space="0" w:color="2D6A4F"/>
+              <w:bottom w:val="single" w:sz="4" w:space="0" w:color="2D6A4F"/>
+              <w:left w:val="single" w:sz="12" w:space="0" w:color="2D6A4F"/>
+              <w:right w:val="single" w:sz="4" w:space="0" w:color="2D6A4F"/>
+            </w:tcBorders>
+          </w:tcPr>
+          <w:p>
+            <w:pPr>
+              <w:spacing w:before="40" w:after="40"/>
+            </w:pPr>
+            <w:r>
+              <w:rPr>
+                <w:b/>
+                <w:sz w:val="20"/>
+              </w:rPr>
+              <w:t xml:space="preserve">TIP:  </w:t>
+            </w:r>
+            <w:r>
+              <w:rPr>
+                <w:sz w:val="20"/>
+              </w:rPr>
+              <w:t>The chairman should monitor the dashboard during the round transition. The "Awaiting transition" card gives the chairman a full view of results to prepare their announcement before the election officer moves to the next round.</w:t>
+            </w:r>
+          </w:p>
+        </w:tc>
+      </w:tr>
+    </w:tbl>
+    <w:p>
+      <w:pPr>
+        <w:spacing w:after="80"/>
+      </w:pPr>
     </w:p>
     <w:p>
       <w:pPr>
@@ -8732,7 +8367,105 @@
           <w:color w:val="1A2744"/>
           <w:sz w:val="26"/>
         </w:rPr>
-        <w:t>Day Before the Meeting</w:t>
+        <w:t>Delete All Election Data</w:t>
+      </w:r>
+    </w:p>
+    <w:p>
+      <w:pPr>
+        <w:spacing w:before="0" w:after="100"/>
+      </w:pPr>
+      <w:r>
+        <w:rPr>
+          <w:sz w:val="22"/>
+        </w:rPr>
+        <w:t>When both offices are complete, a red "Delete All Election Data" button appears at the bottom of the dashboard. This clears all election data and resets the system for the next election. Two confirmation prompts prevent accidental deletion.</w:t>
+      </w:r>
+    </w:p>
+    <w:tbl>
+      <w:tblPr>
+        <w:tblStyle w:val="TableGrid"/>
+        <w:tblW w:type="auto" w:w="0"/>
+        <w:jc w:val="left"/>
+        <w:tblLook w:firstColumn="1" w:firstRow="1" w:lastColumn="0" w:lastRow="0" w:noHBand="0" w:noVBand="1" w:val="04A0"/>
+      </w:tblPr>
+      <w:tblGrid>
+        <w:gridCol w:w="9406"/>
+      </w:tblGrid>
+      <w:tr>
+        <w:tc>
+          <w:tcPr>
+            <w:tcW w:type="dxa" w:w="9406"/>
+            <w:shd w:val="clear" w:color="auto" w:fill="FFF4E0"/>
+            <w:tcBorders>
+              <w:top w:val="single" w:sz="12" w:space="0" w:color="B8942A"/>
+              <w:bottom w:val="single" w:sz="4" w:space="0" w:color="B8942A"/>
+              <w:left w:val="single" w:sz="12" w:space="0" w:color="B8942A"/>
+              <w:right w:val="single" w:sz="4" w:space="0" w:color="B8942A"/>
+            </w:tcBorders>
+          </w:tcPr>
+          <w:p>
+            <w:pPr>
+              <w:spacing w:before="40" w:after="40"/>
+            </w:pPr>
+            <w:r>
+              <w:rPr>
+                <w:b/>
+                <w:sz w:val="20"/>
+              </w:rPr>
+              <w:t xml:space="preserve">IMPORTANT:  </w:t>
+            </w:r>
+            <w:r>
+              <w:rPr>
+                <w:sz w:val="20"/>
+              </w:rPr>
+              <w:t>The Dashboard shows actual vote counts. Only the chairman should have the results password. Do not leave the dashboard visible on an unattended or shared screen.</w:t>
+            </w:r>
+          </w:p>
+        </w:tc>
+      </w:tr>
+    </w:tbl>
+    <w:p>
+      <w:pPr>
+        <w:spacing w:after="80"/>
+      </w:pPr>
+    </w:p>
+    <w:p>
+      <w:pPr>
+        <w:pageBreakBefore/>
+        <w:spacing w:before="360" w:after="120"/>
+        <w:pBdr>
+          <w:bottom w:val="single" w:sz="8" w:space="4" w:color="1a2744"/>
+        </w:pBdr>
+      </w:pPr>
+      <w:r>
+        <w:rPr>
+          <w:b/>
+          <w:color w:val="1A2744"/>
+          <w:sz w:val="36"/>
+        </w:rPr>
+        <w:t>9.  Election Complete Screen</w:t>
+      </w:r>
+    </w:p>
+    <w:p>
+      <w:pPr>
+        <w:spacing w:before="0" w:after="100"/>
+      </w:pPr>
+      <w:r>
+        <w:rPr>
+          <w:sz w:val="22"/>
+        </w:rPr>
+        <w:t>After the election officer clicks "Complete This Office" for the last configured office, the system shows the Election Complete screen. This screen is intended for the election officer and shows which candidates were elected — without vote counts.</w:t>
+      </w:r>
+    </w:p>
+    <w:p>
+      <w:pPr>
+        <w:spacing w:before="0" w:after="100"/>
+      </w:pPr>
+      <w:r>
+        <w:rPr>
+          <w:sz w:val="22"/>
+        </w:rPr>
+        <w:t>The screen displays:</w:t>
       </w:r>
     </w:p>
     <w:p>
@@ -8745,7 +8478,7 @@
         <w:rPr>
           <w:sz w:val="22"/>
         </w:rPr>
-        <w:t>Confirm all nominees are entered correctly in Election Setup.</w:t>
+        <w:t>A navy header: "Election Complete" with the meeting date</w:t>
       </w:r>
     </w:p>
     <w:p>
@@ -8758,7 +8491,7 @@
         <w:rPr>
           <w:sz w:val="22"/>
         </w:rPr>
-        <w:t>Confirm Expected Voters count and note the Majority Required number.</w:t>
+        <w:t>A card for each configured office listing the elected candidates by name only</w:t>
       </w:r>
     </w:p>
     <w:p>
@@ -8771,7 +8504,383 @@
         <w:rPr>
           <w:sz w:val="22"/>
         </w:rPr>
-        <w:t>Test the voter URL on a mobile phone over the network that will be used at the meeting.</w:t>
+        <w:t>A "Back to Home" button to return to the landing page</w:t>
+      </w:r>
+    </w:p>
+    <w:tbl>
+      <w:tblPr>
+        <w:tblStyle w:val="TableGrid"/>
+        <w:tblW w:type="auto" w:w="0"/>
+        <w:jc w:val="left"/>
+        <w:tblLook w:firstColumn="1" w:firstRow="1" w:lastColumn="0" w:lastRow="0" w:noHBand="0" w:noVBand="1" w:val="04A0"/>
+      </w:tblPr>
+      <w:tblGrid>
+        <w:gridCol w:w="9406"/>
+      </w:tblGrid>
+      <w:tr>
+        <w:tc>
+          <w:tcPr>
+            <w:tcW w:type="dxa" w:w="9406"/>
+            <w:shd w:val="clear" w:color="auto" w:fill="E8F0FA"/>
+            <w:tcBorders>
+              <w:top w:val="single" w:sz="12" w:space="0" w:color="1A3A5C"/>
+              <w:bottom w:val="single" w:sz="4" w:space="0" w:color="1A3A5C"/>
+              <w:left w:val="single" w:sz="12" w:space="0" w:color="1A3A5C"/>
+              <w:right w:val="single" w:sz="4" w:space="0" w:color="1A3A5C"/>
+            </w:tcBorders>
+          </w:tcPr>
+          <w:p>
+            <w:pPr>
+              <w:spacing w:before="40" w:after="40"/>
+            </w:pPr>
+            <w:r>
+              <w:rPr>
+                <w:b/>
+                <w:sz w:val="20"/>
+              </w:rPr>
+              <w:t xml:space="preserve">NOTE:  </w:t>
+            </w:r>
+            <w:r>
+              <w:rPr>
+                <w:sz w:val="20"/>
+              </w:rPr>
+              <w:t>Vote counts are intentionally not shown on this screen. The election officer may communicate elected names to the chairman verbally. The chairman then announces results to the congregation and may view vote counts on the Election Dashboard.</w:t>
+            </w:r>
+          </w:p>
+        </w:tc>
+      </w:tr>
+    </w:tbl>
+    <w:p>
+      <w:pPr>
+        <w:spacing w:after="80"/>
+      </w:pPr>
+    </w:p>
+    <w:tbl>
+      <w:tblPr>
+        <w:tblStyle w:val="TableGrid"/>
+        <w:tblW w:type="auto" w:w="0"/>
+        <w:jc w:val="left"/>
+        <w:tblLook w:firstColumn="1" w:firstRow="1" w:lastColumn="0" w:lastRow="0" w:noHBand="0" w:noVBand="1" w:val="04A0"/>
+      </w:tblPr>
+      <w:tblGrid>
+        <w:gridCol w:w="9406"/>
+      </w:tblGrid>
+      <w:tr>
+        <w:tc>
+          <w:tcPr>
+            <w:tcW w:type="dxa" w:w="9406"/>
+            <w:shd w:val="clear" w:color="auto" w:fill="B8942A"/>
+            <w:tcBorders>
+              <w:top w:val="single" w:sz="4" w:space="0" w:color="B8942A"/>
+              <w:bottom w:val="single" w:sz="4" w:space="0" w:color="B8942A"/>
+              <w:left w:val="single" w:sz="4" w:space="0" w:color="B8942A"/>
+              <w:right w:val="single" w:sz="4" w:space="0" w:color="B8942A"/>
+            </w:tcBorders>
+          </w:tcPr>
+          <w:p>
+            <w:pPr>
+              <w:spacing w:before="40" w:after="40"/>
+            </w:pPr>
+            <w:r>
+              <w:rPr>
+                <w:b/>
+                <w:color w:val="FFFFFF"/>
+                <w:sz w:val="18"/>
+              </w:rPr>
+              <w:t xml:space="preserve">  SCREENSHOT — ELECTION COMPLETE SCREEN</w:t>
+            </w:r>
+          </w:p>
+        </w:tc>
+      </w:tr>
+      <w:tr>
+        <w:tc>
+          <w:tcPr>
+            <w:tcW w:type="dxa" w:w="9406"/>
+            <w:shd w:val="clear" w:color="auto" w:fill="FFFBF0"/>
+            <w:tcBorders>
+              <w:top w:val="single" w:sz="4" w:space="0" w:color="B8942A"/>
+              <w:bottom w:val="single" w:sz="4" w:space="0" w:color="B8942A"/>
+              <w:left w:val="single" w:sz="4" w:space="0" w:color="B8942A"/>
+              <w:right w:val="single" w:sz="4" w:space="0" w:color="B8942A"/>
+            </w:tcBorders>
+          </w:tcPr>
+          <w:p>
+            <w:pPr>
+              <w:spacing w:before="120" w:after="320"/>
+              <w:jc w:val="center"/>
+            </w:pPr>
+            <w:r>
+              <w:rPr>
+                <w:i/>
+                <w:color w:val="7C5A00"/>
+                <w:sz w:val="18"/>
+              </w:rPr>
+              <w:t>[ Insert screenshot here ]</w:t>
+              <w:br/>
+              <w:t>Navy header "Election Complete" with meeting date. "Office of Elder" card listing elected names with coloured dot indicators. "Office of Deacon" card below. "Back to Home" button at the bottom.</w:t>
+            </w:r>
+          </w:p>
+        </w:tc>
+      </w:tr>
+    </w:tbl>
+    <w:p>
+      <w:pPr>
+        <w:spacing w:after="120"/>
+      </w:pPr>
+    </w:p>
+    <w:p>
+      <w:pPr>
+        <w:spacing w:before="0" w:after="100"/>
+      </w:pPr>
+      <w:r>
+        <w:rPr>
+          <w:sz w:val="22"/>
+        </w:rPr>
+        <w:t>Simultaneously, all voters' screens automatically update to show a plain thank-you message: "Thank you for participating in the [Church Name] office bearer election. The election has been completed. The chairman will announce the results."</w:t>
+      </w:r>
+    </w:p>
+    <w:p>
+      <w:pPr>
+        <w:pageBreakBefore/>
+        <w:spacing w:before="360" w:after="120"/>
+        <w:pBdr>
+          <w:bottom w:val="single" w:sz="8" w:space="4" w:color="1a2744"/>
+        </w:pBdr>
+      </w:pPr>
+      <w:r>
+        <w:rPr>
+          <w:b/>
+          <w:color w:val="1A2744"/>
+          <w:sz w:val="36"/>
+        </w:rPr>
+        <w:t>10.  Best Practices &amp; Suggested Workflow</w:t>
+      </w:r>
+    </w:p>
+    <w:p>
+      <w:pPr>
+        <w:spacing w:before="240" w:after="80"/>
+      </w:pPr>
+      <w:r>
+        <w:rPr>
+          <w:b/>
+          <w:color w:val="1A2744"/>
+          <w:sz w:val="26"/>
+        </w:rPr>
+        <w:t>Roles &amp; Responsibilities</w:t>
+      </w:r>
+    </w:p>
+    <w:tbl>
+      <w:tblPr>
+        <w:tblStyle w:val="TableGrid"/>
+        <w:tblW w:type="auto" w:w="0"/>
+        <w:jc w:val="left"/>
+        <w:tblLook w:firstColumn="1" w:firstRow="1" w:lastColumn="0" w:lastRow="0" w:noHBand="0" w:noVBand="1" w:val="04A0"/>
+      </w:tblPr>
+      <w:tblGrid>
+        <w:gridCol w:w="4703"/>
+        <w:gridCol w:w="4703"/>
+      </w:tblGrid>
+      <w:tr>
+        <w:tc>
+          <w:tcPr>
+            <w:tcW w:type="dxa" w:w="2551"/>
+            <w:shd w:val="clear" w:color="auto" w:fill="1A2744"/>
+          </w:tcPr>
+          <w:p>
+            <w:pPr>
+              <w:spacing w:before="40" w:after="40"/>
+            </w:pPr>
+            <w:r>
+              <w:rPr>
+                <w:b/>
+                <w:color w:val="FFFFFF"/>
+                <w:sz w:val="20"/>
+              </w:rPr>
+              <w:t>Role</w:t>
+            </w:r>
+          </w:p>
+        </w:tc>
+        <w:tc>
+          <w:tcPr>
+            <w:tcW w:type="dxa" w:w="6520"/>
+            <w:shd w:val="clear" w:color="auto" w:fill="1A2744"/>
+          </w:tcPr>
+          <w:p>
+            <w:pPr>
+              <w:spacing w:before="40" w:after="40"/>
+            </w:pPr>
+            <w:r>
+              <w:rPr>
+                <w:b/>
+                <w:color w:val="FFFFFF"/>
+                <w:sz w:val="20"/>
+              </w:rPr>
+              <w:t>Responsibilities During Election</w:t>
+            </w:r>
+          </w:p>
+        </w:tc>
+      </w:tr>
+      <w:tr>
+        <w:tc>
+          <w:tcPr>
+            <w:tcW w:type="dxa" w:w="2551"/>
+            <w:shd w:val="clear" w:color="auto" w:fill="FFFFFF"/>
+          </w:tcPr>
+          <w:p>
+            <w:pPr>
+              <w:spacing w:before="40" w:after="40"/>
+            </w:pPr>
+            <w:r>
+              <w:rPr>
+                <w:sz w:val="20"/>
+              </w:rPr>
+              <w:t>Election Officer</w:t>
+            </w:r>
+          </w:p>
+        </w:tc>
+        <w:tc>
+          <w:tcPr>
+            <w:tcW w:type="dxa" w:w="6520"/>
+            <w:shd w:val="clear" w:color="auto" w:fill="FFFFFF"/>
+          </w:tcPr>
+          <w:p>
+            <w:pPr>
+              <w:spacing w:before="40" w:after="40"/>
+            </w:pPr>
+            <w:r>
+              <w:rPr>
+                <w:sz w:val="20"/>
+              </w:rPr>
+              <w:t>Operates Round Control; opens/closes voting; processes round transitions; does not share admin password</w:t>
+            </w:r>
+          </w:p>
+        </w:tc>
+      </w:tr>
+      <w:tr>
+        <w:tc>
+          <w:tcPr>
+            <w:tcW w:type="dxa" w:w="2551"/>
+            <w:shd w:val="clear" w:color="auto" w:fill="F8F6F1"/>
+          </w:tcPr>
+          <w:p>
+            <w:pPr>
+              <w:spacing w:before="40" w:after="40"/>
+            </w:pPr>
+            <w:r>
+              <w:rPr>
+                <w:sz w:val="20"/>
+              </w:rPr>
+              <w:t>Chairman</w:t>
+            </w:r>
+          </w:p>
+        </w:tc>
+        <w:tc>
+          <w:tcPr>
+            <w:tcW w:type="dxa" w:w="6520"/>
+            <w:shd w:val="clear" w:color="auto" w:fill="F8F6F1"/>
+          </w:tcPr>
+          <w:p>
+            <w:pPr>
+              <w:spacing w:before="40" w:after="40"/>
+            </w:pPr>
+            <w:r>
+              <w:rPr>
+                <w:sz w:val="20"/>
+              </w:rPr>
+              <w:t>Announces candidates and voting instructions; accesses Election Dashboard; announces results verbally</w:t>
+            </w:r>
+          </w:p>
+        </w:tc>
+      </w:tr>
+      <w:tr>
+        <w:tc>
+          <w:tcPr>
+            <w:tcW w:type="dxa" w:w="2551"/>
+            <w:shd w:val="clear" w:color="auto" w:fill="FFFFFF"/>
+          </w:tcPr>
+          <w:p>
+            <w:pPr>
+              <w:spacing w:before="40" w:after="40"/>
+            </w:pPr>
+            <w:r>
+              <w:rPr>
+                <w:sz w:val="20"/>
+              </w:rPr>
+              <w:t>Paper Ballot Volunteer</w:t>
+            </w:r>
+          </w:p>
+        </w:tc>
+        <w:tc>
+          <w:tcPr>
+            <w:tcW w:type="dxa" w:w="6520"/>
+            <w:shd w:val="clear" w:color="auto" w:fill="FFFFFF"/>
+          </w:tcPr>
+          <w:p>
+            <w:pPr>
+              <w:spacing w:before="40" w:after="40"/>
+            </w:pPr>
+            <w:r>
+              <w:rPr>
+                <w:sz w:val="20"/>
+              </w:rPr>
+              <w:t>Operates Paper Ballot Entry station; collects paper ballots from members; enters them during the voting period</w:t>
+            </w:r>
+          </w:p>
+        </w:tc>
+      </w:tr>
+      <w:tr>
+        <w:tc>
+          <w:tcPr>
+            <w:tcW w:type="dxa" w:w="2551"/>
+            <w:shd w:val="clear" w:color="auto" w:fill="F8F6F1"/>
+          </w:tcPr>
+          <w:p>
+            <w:pPr>
+              <w:spacing w:before="40" w:after="40"/>
+            </w:pPr>
+            <w:r>
+              <w:rPr>
+                <w:sz w:val="20"/>
+              </w:rPr>
+              <w:t>Door Steward</w:t>
+            </w:r>
+          </w:p>
+        </w:tc>
+        <w:tc>
+          <w:tcPr>
+            <w:tcW w:type="dxa" w:w="6520"/>
+            <w:shd w:val="clear" w:color="auto" w:fill="F8F6F1"/>
+          </w:tcPr>
+          <w:p>
+            <w:pPr>
+              <w:spacing w:before="40" w:after="40"/>
+            </w:pPr>
+            <w:r>
+              <w:rPr>
+                <w:sz w:val="20"/>
+              </w:rPr>
+              <w:t>Distributes token cards to verified eligible voters as they enter</w:t>
+            </w:r>
+          </w:p>
+        </w:tc>
+      </w:tr>
+    </w:tbl>
+    <w:p>
+      <w:pPr>
+        <w:spacing w:after="120"/>
+      </w:pPr>
+    </w:p>
+    <w:p>
+      <w:pPr>
+        <w:spacing w:before="240" w:after="80"/>
+      </w:pPr>
+      <w:r>
+        <w:rPr>
+          <w:b/>
+          <w:color w:val="1A2744"/>
+          <w:sz w:val="26"/>
+        </w:rPr>
+        <w:t>Preparation — At Least 1 Week Before the Meeting</w:t>
       </w:r>
     </w:p>
     <w:p>
@@ -8784,7 +8893,7 @@
         <w:rPr>
           <w:sz w:val="22"/>
         </w:rPr>
-        <w:t>Confirm the QR code scans correctly and opens vote.html.</w:t>
+        <w:t>Confirm the list of nominees for each office with the consistory.</w:t>
       </w:r>
     </w:p>
     <w:p>
@@ -8797,7 +8906,7 @@
         <w:rPr>
           <w:sz w:val="22"/>
         </w:rPr>
-        <w:t>Brief the paper ballot volunteer on their role.</w:t>
+        <w:t>Confirm the number of eligible voters (communicant male members).</w:t>
       </w:r>
     </w:p>
     <w:p>
@@ -8810,7 +8919,59 @@
         <w:rPr>
           <w:sz w:val="22"/>
         </w:rPr>
-        <w:t>Brief the chairman on the results password and how to access the Election Dashboard.</w:t>
+        <w:t>Test the system end-to-end using a laptop and two phones.</w:t>
+      </w:r>
+    </w:p>
+    <w:p>
+      <w:pPr>
+        <w:pStyle w:val="ListBullet"/>
+        <w:spacing w:before="0" w:after="60"/>
+        <w:ind w:left="283"/>
+      </w:pPr>
+      <w:r>
+        <w:rPr>
+          <w:sz w:val="22"/>
+        </w:rPr>
+        <w:t>Change both passwords from the defaults in Election Setup → Settings.</w:t>
+      </w:r>
+    </w:p>
+    <w:p>
+      <w:pPr>
+        <w:pStyle w:val="ListBullet"/>
+        <w:spacing w:before="0" w:after="60"/>
+        <w:ind w:left="283"/>
+      </w:pPr>
+      <w:r>
+        <w:rPr>
+          <w:sz w:val="22"/>
+        </w:rPr>
+        <w:t>Record both passwords securely — there is no password recovery option.</w:t>
+      </w:r>
+    </w:p>
+    <w:p>
+      <w:pPr>
+        <w:pStyle w:val="ListBullet"/>
+        <w:spacing w:before="0" w:after="60"/>
+        <w:ind w:left="283"/>
+      </w:pPr>
+      <w:r>
+        <w:rPr>
+          <w:sz w:val="22"/>
+        </w:rPr>
+        <w:t>Print token cards and cut them. Store securely.</w:t>
+      </w:r>
+    </w:p>
+    <w:p>
+      <w:pPr>
+        <w:pStyle w:val="ListBullet"/>
+        <w:spacing w:before="0" w:after="60"/>
+        <w:ind w:left="283"/>
+      </w:pPr>
+      <w:r>
+        <w:rPr>
+          <w:sz w:val="22"/>
+        </w:rPr>
+        <w:t>Print paper ballots for each office (recommend 15–20% of expected voter count).</w:t>
       </w:r>
     </w:p>
     <w:p>
@@ -8823,6 +8984,97 @@
           <w:color w:val="1A2744"/>
           <w:sz w:val="26"/>
         </w:rPr>
+        <w:t>Day Before the Meeting</w:t>
+      </w:r>
+    </w:p>
+    <w:p>
+      <w:pPr>
+        <w:pStyle w:val="ListBullet"/>
+        <w:spacing w:before="0" w:after="60"/>
+        <w:ind w:left="283"/>
+      </w:pPr>
+      <w:r>
+        <w:rPr>
+          <w:sz w:val="22"/>
+        </w:rPr>
+        <w:t>Confirm all nominees are entered correctly in Election Setup.</w:t>
+      </w:r>
+    </w:p>
+    <w:p>
+      <w:pPr>
+        <w:pStyle w:val="ListBullet"/>
+        <w:spacing w:before="0" w:after="60"/>
+        <w:ind w:left="283"/>
+      </w:pPr>
+      <w:r>
+        <w:rPr>
+          <w:sz w:val="22"/>
+        </w:rPr>
+        <w:t>Confirm Expected Voters count and note the Majority Required number.</w:t>
+      </w:r>
+    </w:p>
+    <w:p>
+      <w:pPr>
+        <w:pStyle w:val="ListBullet"/>
+        <w:spacing w:before="0" w:after="60"/>
+        <w:ind w:left="283"/>
+      </w:pPr>
+      <w:r>
+        <w:rPr>
+          <w:sz w:val="22"/>
+        </w:rPr>
+        <w:t>Test the voter URL on a mobile phone over the network that will be used at the meeting.</w:t>
+      </w:r>
+    </w:p>
+    <w:p>
+      <w:pPr>
+        <w:pStyle w:val="ListBullet"/>
+        <w:spacing w:before="0" w:after="60"/>
+        <w:ind w:left="283"/>
+      </w:pPr>
+      <w:r>
+        <w:rPr>
+          <w:sz w:val="22"/>
+        </w:rPr>
+        <w:t>Confirm the QR code scans correctly and opens vote.html.</w:t>
+      </w:r>
+    </w:p>
+    <w:p>
+      <w:pPr>
+        <w:pStyle w:val="ListBullet"/>
+        <w:spacing w:before="0" w:after="60"/>
+        <w:ind w:left="283"/>
+      </w:pPr>
+      <w:r>
+        <w:rPr>
+          <w:sz w:val="22"/>
+        </w:rPr>
+        <w:t>Brief the paper ballot volunteer on their role.</w:t>
+      </w:r>
+    </w:p>
+    <w:p>
+      <w:pPr>
+        <w:pStyle w:val="ListBullet"/>
+        <w:spacing w:before="0" w:after="60"/>
+        <w:ind w:left="283"/>
+      </w:pPr>
+      <w:r>
+        <w:rPr>
+          <w:sz w:val="22"/>
+        </w:rPr>
+        <w:t>Brief the chairman on the results password and how to access the Election Dashboard.</w:t>
+      </w:r>
+    </w:p>
+    <w:p>
+      <w:pPr>
+        <w:spacing w:before="240" w:after="80"/>
+      </w:pPr>
+      <w:r>
+        <w:rPr>
+          <w:b/>
+          <w:color w:val="1A2744"/>
+          <w:sz w:val="26"/>
+        </w:rPr>
         <w:t>On the Day — Before the Meeting Starts</w:t>
       </w:r>
     </w:p>
@@ -9044,7 +9296,7 @@
         <w:rPr>
           <w:sz w:val="22"/>
         </w:rPr>
-        <w:t>If all positions are filled: click Complete This Office. If not: click Launch Next Round.</w:t>
+        <w:t>If all positions are filled: click Complete This Office. If not: click Launch Next Round — Round Control opens with voting closed so the chairman can announce the new round first.</w:t>
       </w:r>
     </w:p>
     <w:p>
@@ -11058,7 +11310,20 @@
         <w:rPr>
           <w:sz w:val="22"/>
         </w:rPr>
-        <w:t>Click Launch Round 2 Voting.</w:t>
+        <w:t>Click Launch Next Round. Round Control opens with voting closed.</w:t>
+      </w:r>
+    </w:p>
+    <w:p>
+      <w:pPr>
+        <w:pStyle w:val="ListNumber"/>
+        <w:spacing w:before="0" w:after="60"/>
+        <w:ind w:left="283"/>
+      </w:pPr>
+      <w:r>
+        <w:rPr>
+          <w:sz w:val="22"/>
+        </w:rPr>
+        <w:t>Chairman announces the Round 2 candidates. Election officer clicks Open Voting.</w:t>
       </w:r>
     </w:p>
     <w:p>
@@ -13725,7 +13990,7 @@
           <w:color w:val="666666"/>
           <w:sz w:val="18"/>
         </w:rPr>
-        <w:t>Church Office Bearer Election System — User Manual  |  Version 1.1.1</w:t>
+        <w:t>Church Office Bearer Election System — User Manual  |  Version 1.1.5</w:t>
         <w:br/>
         <w:t>All data is stored on the local server. No votes leave the meeting network.</w:t>
       </w:r>

</xml_diff>